<commit_message>
docs & feat: actualizar manuales con Webhook online v10.3.0 e integracion Redsys
</commit_message>
<xml_diff>
--- a/MANUAL_RECEPCION_PAYGOLD_GUADIANA.docx
+++ b/MANUAL_RECEPCION_PAYGOLD_GUADIANA.docx
@@ -4,44 +4,50 @@
   <w:body>
     <w:p>
       <w:pPr>
-        <w:jc w:val="center"/>
+        <w:spacing w:before="0" w:after="80"/>
       </w:pPr>
       <w:r>
         <w:rPr>
+          <w:rFonts w:ascii="Calibri" w:hAnsi="Calibri"/>
+          <w:b/>
+          <w:color w:val="166534"/>
+          <w:sz w:val="20"/>
+        </w:rPr>
+        <w:t>SERCOTEL HOTEL GUADIANA • MANUAL OPERATIVO RECEPCIÓN</w:t>
+        <w:br/>
+      </w:r>
+      <w:r>
+        <w:rPr>
+          <w:rFonts w:ascii="Calibri" w:hAnsi="Calibri"/>
           <w:b/>
           <w:color w:val="0F172A"/>
-          <w:sz w:val="42"/>
+          <w:sz w:val="44"/>
         </w:rPr>
-        <w:t>MANUAL OPERATIVO PARA RECEPCIÓN</w:t>
+        <w:t>Gestión de Garantías y Pagos PayGold (Eurocaja Rural)</w:t>
       </w:r>
     </w:p>
     <w:p>
       <w:pPr>
-        <w:jc w:val="center"/>
+        <w:spacing w:after="280"/>
       </w:pPr>
       <w:r>
         <w:rPr>
-          <w:color w:val="64748B"/>
-          <w:sz w:val="22"/>
+          <w:color w:val="475569"/>
+          <w:sz w:val="21"/>
         </w:rPr>
-        <w:t>Procedimiento de Cobros, Seguridad Anti-Fraude PayGold (Eurocaja Rural) y WhatsApp</w:t>
-        <w:br/>
-        <w:t>Sercotel Hotel Guadiana • MesaChef Matrix v10.2.1</w:t>
+        <w:t>Procedimiento oficial para registrar reservas en MesaChef Matrix v10.3.0, generar enlaces bancarios seguros en Eurocaja Rural (Redsys PayGold), enviar confirmaciones con cláusula de cancelación por WhatsApp, la sincronización automática online mediante Webhook y la conciliación contable con Administración.</w:t>
       </w:r>
     </w:p>
     <w:p>
       <w:pPr>
-        <w:spacing w:after="80"/>
+        <w:pStyle w:val="Heading1"/>
+        <w:spacing w:before="280" w:after="120"/>
       </w:pPr>
-    </w:p>
-    <w:p>
       <w:r>
         <w:rPr>
-          <w:b/>
-          <w:color w:val="15803D"/>
-          <w:sz w:val="26"/>
+          <w:color w:val="1E293B"/>
         </w:rPr>
-        <w:t>1. DATOS CLAVE DE CONFIGURACIÓN Y ACCESO</w:t>
+        <w:t>1. Datos Clave de Acceso y Configuración</w:t>
       </w:r>
     </w:p>
     <w:tbl>
@@ -52,72 +58,29 @@
         <w:tblLook w:firstColumn="1" w:firstRow="1" w:lastColumn="0" w:lastRow="0" w:noHBand="0" w:noVBand="1" w:val="04A0"/>
       </w:tblPr>
       <w:tblGrid>
-        <w:gridCol w:w="3168"/>
-        <w:gridCol w:w="6480"/>
+        <w:gridCol w:w="4968"/>
+        <w:gridCol w:w="4968"/>
       </w:tblGrid>
       <w:tr>
         <w:tc>
           <w:tcPr>
-            <w:tcW w:type="dxa" w:w="4968"/>
-            <w:shd w:fill="166534"/>
+            <w:tcW w:type="dxa" w:w="3168"/>
+            <w:shd w:fill="F8FAFC"/>
             <w:tcMar>
-              <w:top w:w="130" w:type="dxa"/>
-              <w:bottom w:w="130" w:type="dxa"/>
-              <w:left w:w="150" w:type="dxa"/>
-              <w:right w:w="150" w:type="dxa"/>
+              <w:top w:w="120" w:type="dxa"/>
+              <w:bottom w:w="120" w:type="dxa"/>
+              <w:left w:w="180" w:type="dxa"/>
+              <w:right w:w="180" w:type="dxa"/>
             </w:tcMar>
           </w:tcPr>
           <w:p>
+            <w:pPr>
+              <w:spacing w:after="40"/>
+            </w:pPr>
             <w:r>
               <w:rPr>
                 <w:b/>
-                <w:color w:val="FFFFFF"/>
-                <w:sz w:val="20"/>
-              </w:rPr>
-              <w:t>Parámetro</w:t>
-            </w:r>
-          </w:p>
-        </w:tc>
-        <w:tc>
-          <w:tcPr>
-            <w:tcW w:type="dxa" w:w="4968"/>
-            <w:shd w:fill="166534"/>
-            <w:tcMar>
-              <w:top w:w="130" w:type="dxa"/>
-              <w:bottom w:w="130" w:type="dxa"/>
-              <w:left w:w="150" w:type="dxa"/>
-              <w:right w:w="150" w:type="dxa"/>
-            </w:tcMar>
-          </w:tcPr>
-          <w:p>
-            <w:r>
-              <w:rPr>
-                <w:b/>
-                <w:color w:val="FFFFFF"/>
-                <w:sz w:val="20"/>
-              </w:rPr>
-              <w:t>Valor Oficial</w:t>
-            </w:r>
-          </w:p>
-        </w:tc>
-      </w:tr>
-      <w:tr>
-        <w:tc>
-          <w:tcPr>
-            <w:tcW w:type="dxa" w:w="4968"/>
-            <w:shd w:fill="F8FAFC"/>
-            <w:tcMar>
-              <w:top w:w="90" w:type="dxa"/>
-              <w:bottom w:w="90" w:type="dxa"/>
-              <w:left w:w="130" w:type="dxa"/>
-              <w:right w:w="130" w:type="dxa"/>
-            </w:tcMar>
-          </w:tcPr>
-          <w:p>
-            <w:r>
-              <w:rPr>
-                <w:b/>
-                <w:color w:val="1E293B"/>
+                <w:color w:val="334155"/>
                 <w:sz w:val="19"/>
               </w:rPr>
               <w:t>Establecimiento</w:t>
@@ -126,21 +89,24 @@
         </w:tc>
         <w:tc>
           <w:tcPr>
-            <w:tcW w:type="dxa" w:w="4968"/>
-            <w:shd w:fill="F8FAFC"/>
+            <w:tcW w:type="dxa" w:w="6624"/>
+            <w:shd w:fill="FFFFFF"/>
             <w:tcMar>
-              <w:top w:w="90" w:type="dxa"/>
-              <w:bottom w:w="90" w:type="dxa"/>
-              <w:left w:w="130" w:type="dxa"/>
-              <w:right w:w="130" w:type="dxa"/>
+              <w:top w:w="120" w:type="dxa"/>
+              <w:bottom w:w="120" w:type="dxa"/>
+              <w:left w:w="180" w:type="dxa"/>
+              <w:right w:w="180" w:type="dxa"/>
             </w:tcMar>
           </w:tcPr>
           <w:p>
+            <w:pPr>
+              <w:spacing w:after="40"/>
+            </w:pPr>
             <w:r>
               <w:rPr>
                 <w:sz w:val="19"/>
               </w:rPr>
-              <w:t>Sercotel Guadiana</w:t>
+              <w:t>Sercotel Hotel Guadiana</w:t>
             </w:r>
           </w:p>
         </w:tc>
@@ -148,20 +114,23 @@
       <w:tr>
         <w:tc>
           <w:tcPr>
-            <w:tcW w:type="dxa" w:w="4968"/>
-            <w:shd w:fill="FFFFFF"/>
+            <w:tcW w:type="dxa" w:w="3168"/>
+            <w:shd w:fill="F8FAFC"/>
             <w:tcMar>
-              <w:top w:w="90" w:type="dxa"/>
-              <w:bottom w:w="90" w:type="dxa"/>
-              <w:left w:w="130" w:type="dxa"/>
-              <w:right w:w="130" w:type="dxa"/>
+              <w:top w:w="120" w:type="dxa"/>
+              <w:bottom w:w="120" w:type="dxa"/>
+              <w:left w:w="180" w:type="dxa"/>
+              <w:right w:w="180" w:type="dxa"/>
             </w:tcMar>
           </w:tcPr>
           <w:p>
+            <w:pPr>
+              <w:spacing w:after="40"/>
+            </w:pPr>
             <w:r>
               <w:rPr>
                 <w:b/>
-                <w:color w:val="1E293B"/>
+                <w:color w:val="334155"/>
                 <w:sz w:val="19"/>
               </w:rPr>
               <w:t>Entidad Bancaria</w:t>
@@ -170,16 +139,19 @@
         </w:tc>
         <w:tc>
           <w:tcPr>
-            <w:tcW w:type="dxa" w:w="4968"/>
-            <w:shd w:fill="FFFFFF"/>
+            <w:tcW w:type="dxa" w:w="6624"/>
+            <w:shd w:fill="F8FAFC"/>
             <w:tcMar>
-              <w:top w:w="90" w:type="dxa"/>
-              <w:bottom w:w="90" w:type="dxa"/>
-              <w:left w:w="130" w:type="dxa"/>
-              <w:right w:w="130" w:type="dxa"/>
+              <w:top w:w="120" w:type="dxa"/>
+              <w:bottom w:w="120" w:type="dxa"/>
+              <w:left w:w="180" w:type="dxa"/>
+              <w:right w:w="180" w:type="dxa"/>
             </w:tcMar>
           </w:tcPr>
           <w:p>
+            <w:pPr>
+              <w:spacing w:after="40"/>
+            </w:pPr>
             <w:r>
               <w:rPr>
                 <w:sz w:val="19"/>
@@ -192,43 +164,51 @@
       <w:tr>
         <w:tc>
           <w:tcPr>
-            <w:tcW w:type="dxa" w:w="4968"/>
+            <w:tcW w:type="dxa" w:w="3168"/>
             <w:shd w:fill="F8FAFC"/>
             <w:tcMar>
-              <w:top w:w="90" w:type="dxa"/>
-              <w:bottom w:w="90" w:type="dxa"/>
-              <w:left w:w="130" w:type="dxa"/>
-              <w:right w:w="130" w:type="dxa"/>
+              <w:top w:w="120" w:type="dxa"/>
+              <w:bottom w:w="120" w:type="dxa"/>
+              <w:left w:w="180" w:type="dxa"/>
+              <w:right w:w="180" w:type="dxa"/>
             </w:tcMar>
           </w:tcPr>
           <w:p>
+            <w:pPr>
+              <w:spacing w:after="40"/>
+            </w:pPr>
             <w:r>
               <w:rPr>
                 <w:b/>
-                <w:color w:val="1E293B"/>
+                <w:color w:val="334155"/>
                 <w:sz w:val="19"/>
               </w:rPr>
-              <w:t>Usuario / Terminal TPV</w:t>
+              <w:t>Usuario TPV Virtual</w:t>
             </w:r>
           </w:p>
         </w:tc>
         <w:tc>
           <w:tcPr>
-            <w:tcW w:type="dxa" w:w="4968"/>
-            <w:shd w:fill="F8FAFC"/>
+            <w:tcW w:type="dxa" w:w="6624"/>
+            <w:shd w:fill="FFFFFF"/>
             <w:tcMar>
-              <w:top w:w="90" w:type="dxa"/>
-              <w:bottom w:w="90" w:type="dxa"/>
-              <w:left w:w="130" w:type="dxa"/>
-              <w:right w:w="130" w:type="dxa"/>
+              <w:top w:w="120" w:type="dxa"/>
+              <w:bottom w:w="120" w:type="dxa"/>
+              <w:left w:w="180" w:type="dxa"/>
+              <w:right w:w="180" w:type="dxa"/>
             </w:tcMar>
           </w:tcPr>
           <w:p>
+            <w:pPr>
+              <w:spacing w:after="40"/>
+            </w:pPr>
             <w:r>
               <w:rPr>
+                <w:b/>
+                <w:color w:val="0284C7"/>
                 <w:sz w:val="19"/>
               </w:rPr>
-              <w:t>168355840-001 (Obligatorio escribir el terminal -001)</w:t>
+              <w:t>168355840-001 (Imprescindible incluir el terminal -001)</w:t>
             </w:r>
           </w:p>
         </w:tc>
@@ -236,20 +216,23 @@
       <w:tr>
         <w:tc>
           <w:tcPr>
-            <w:tcW w:type="dxa" w:w="4968"/>
-            <w:shd w:fill="FFFFFF"/>
+            <w:tcW w:type="dxa" w:w="3168"/>
+            <w:shd w:fill="F8FAFC"/>
             <w:tcMar>
-              <w:top w:w="90" w:type="dxa"/>
-              <w:bottom w:w="90" w:type="dxa"/>
-              <w:left w:w="130" w:type="dxa"/>
-              <w:right w:w="130" w:type="dxa"/>
+              <w:top w:w="120" w:type="dxa"/>
+              <w:bottom w:w="120" w:type="dxa"/>
+              <w:left w:w="180" w:type="dxa"/>
+              <w:right w:w="180" w:type="dxa"/>
             </w:tcMar>
           </w:tcPr>
           <w:p>
+            <w:pPr>
+              <w:spacing w:after="40"/>
+            </w:pPr>
             <w:r>
               <w:rPr>
                 <w:b/>
-                <w:color w:val="1E293B"/>
+                <w:color w:val="334155"/>
                 <w:sz w:val="19"/>
               </w:rPr>
               <w:t>Portal de Acceso TPV</w:t>
@@ -258,18 +241,23 @@
         </w:tc>
         <w:tc>
           <w:tcPr>
-            <w:tcW w:type="dxa" w:w="4968"/>
-            <w:shd w:fill="FFFFFF"/>
+            <w:tcW w:type="dxa" w:w="6624"/>
+            <w:shd w:fill="F8FAFC"/>
             <w:tcMar>
-              <w:top w:w="90" w:type="dxa"/>
-              <w:bottom w:w="90" w:type="dxa"/>
-              <w:left w:w="130" w:type="dxa"/>
-              <w:right w:w="130" w:type="dxa"/>
+              <w:top w:w="120" w:type="dxa"/>
+              <w:bottom w:w="120" w:type="dxa"/>
+              <w:left w:w="180" w:type="dxa"/>
+              <w:right w:w="180" w:type="dxa"/>
             </w:tcMar>
           </w:tcPr>
           <w:p>
+            <w:pPr>
+              <w:spacing w:after="40"/>
+            </w:pPr>
             <w:r>
               <w:rPr>
+                <w:b/>
+                <w:color w:val="0284C7"/>
                 <w:sz w:val="19"/>
               </w:rPr>
               <w:t>https://canales.redsys.es/portal</w:t>
@@ -280,43 +268,51 @@
       <w:tr>
         <w:tc>
           <w:tcPr>
-            <w:tcW w:type="dxa" w:w="4968"/>
+            <w:tcW w:type="dxa" w:w="3168"/>
             <w:shd w:fill="F8FAFC"/>
             <w:tcMar>
-              <w:top w:w="90" w:type="dxa"/>
-              <w:bottom w:w="90" w:type="dxa"/>
-              <w:left w:w="130" w:type="dxa"/>
-              <w:right w:w="130" w:type="dxa"/>
+              <w:top w:w="120" w:type="dxa"/>
+              <w:bottom w:w="120" w:type="dxa"/>
+              <w:left w:w="180" w:type="dxa"/>
+              <w:right w:w="180" w:type="dxa"/>
             </w:tcMar>
           </w:tcPr>
           <w:p>
+            <w:pPr>
+              <w:spacing w:after="40"/>
+            </w:pPr>
             <w:r>
               <w:rPr>
                 <w:b/>
-                <w:color w:val="1E293B"/>
+                <w:color w:val="334155"/>
                 <w:sz w:val="19"/>
               </w:rPr>
-              <w:t>Email Notificaciones</w:t>
+              <w:t>URL Notificación Online (Webhook)</w:t>
             </w:r>
           </w:p>
         </w:tc>
         <w:tc>
           <w:tcPr>
-            <w:tcW w:type="dxa" w:w="4968"/>
-            <w:shd w:fill="F8FAFC"/>
+            <w:tcW w:type="dxa" w:w="6624"/>
+            <w:shd w:fill="FFFFFF"/>
             <w:tcMar>
-              <w:top w:w="90" w:type="dxa"/>
-              <w:bottom w:w="90" w:type="dxa"/>
-              <w:left w:w="130" w:type="dxa"/>
-              <w:right w:w="130" w:type="dxa"/>
+              <w:top w:w="120" w:type="dxa"/>
+              <w:bottom w:w="120" w:type="dxa"/>
+              <w:left w:w="180" w:type="dxa"/>
+              <w:right w:w="180" w:type="dxa"/>
             </w:tcMar>
           </w:tcPr>
           <w:p>
+            <w:pPr>
+              <w:spacing w:after="40"/>
+            </w:pPr>
             <w:r>
               <w:rPr>
+                <w:b/>
+                <w:color w:val="0284C7"/>
                 <w:sz w:val="19"/>
               </w:rPr>
-              <w:t>administracion@hotelguadiana.es (Bandeja de Isabel)</w:t>
+              <w:t>https://europe-west1-mesa-chef-prod.cloudfunctions.net/redsysWebhook</w:t>
             </w:r>
           </w:p>
         </w:tc>
@@ -324,43 +320,99 @@
       <w:tr>
         <w:tc>
           <w:tcPr>
-            <w:tcW w:type="dxa" w:w="4968"/>
-            <w:shd w:fill="FFFFFF"/>
+            <w:tcW w:type="dxa" w:w="3168"/>
+            <w:shd w:fill="F8FAFC"/>
             <w:tcMar>
-              <w:top w:w="90" w:type="dxa"/>
-              <w:bottom w:w="90" w:type="dxa"/>
-              <w:left w:w="130" w:type="dxa"/>
-              <w:right w:w="130" w:type="dxa"/>
+              <w:top w:w="120" w:type="dxa"/>
+              <w:bottom w:w="120" w:type="dxa"/>
+              <w:left w:w="180" w:type="dxa"/>
+              <w:right w:w="180" w:type="dxa"/>
             </w:tcMar>
           </w:tcPr>
           <w:p>
+            <w:pPr>
+              <w:spacing w:after="40"/>
+            </w:pPr>
             <w:r>
               <w:rPr>
                 <w:b/>
-                <w:color w:val="1E293B"/>
+                <w:color w:val="334155"/>
                 <w:sz w:val="19"/>
               </w:rPr>
-              <w:t>Circuito de Confirmación</w:t>
+              <w:t>Sincronización Automática</w:t>
             </w:r>
           </w:p>
         </w:tc>
         <w:tc>
           <w:tcPr>
-            <w:tcW w:type="dxa" w:w="4968"/>
-            <w:shd w:fill="FFFFFF"/>
+            <w:tcW w:type="dxa" w:w="6624"/>
+            <w:shd w:fill="F8FAFC"/>
             <w:tcMar>
-              <w:top w:w="90" w:type="dxa"/>
-              <w:bottom w:w="90" w:type="dxa"/>
-              <w:left w:w="130" w:type="dxa"/>
-              <w:right w:w="130" w:type="dxa"/>
+              <w:top w:w="120" w:type="dxa"/>
+              <w:bottom w:w="120" w:type="dxa"/>
+              <w:left w:w="180" w:type="dxa"/>
+              <w:right w:w="180" w:type="dxa"/>
             </w:tcMar>
           </w:tcPr>
           <w:p>
+            <w:pPr>
+              <w:spacing w:after="40"/>
+            </w:pPr>
             <w:r>
               <w:rPr>
                 <w:sz w:val="19"/>
               </w:rPr>
-              <w:t>Isabel recibe el justificante de Eurocaja y lo REENVÍA a Recepción para su control y apunte en MesaChef.</w:t>
+              <w:t>Instantánea: MesaChef pasa a 🟢 Garantizado y anota el pago al momento</w:t>
+            </w:r>
+          </w:p>
+        </w:tc>
+      </w:tr>
+      <w:tr>
+        <w:tc>
+          <w:tcPr>
+            <w:tcW w:type="dxa" w:w="3168"/>
+            <w:shd w:fill="F8FAFC"/>
+            <w:tcMar>
+              <w:top w:w="120" w:type="dxa"/>
+              <w:bottom w:w="120" w:type="dxa"/>
+              <w:left w:w="180" w:type="dxa"/>
+              <w:right w:w="180" w:type="dxa"/>
+            </w:tcMar>
+          </w:tcPr>
+          <w:p>
+            <w:pPr>
+              <w:spacing w:after="40"/>
+            </w:pPr>
+            <w:r>
+              <w:rPr>
+                <w:b/>
+                <w:color w:val="334155"/>
+                <w:sz w:val="19"/>
+              </w:rPr>
+              <w:t>Email Oficial de Cobro</w:t>
+            </w:r>
+          </w:p>
+        </w:tc>
+        <w:tc>
+          <w:tcPr>
+            <w:tcW w:type="dxa" w:w="6624"/>
+            <w:shd w:fill="FFFFFF"/>
+            <w:tcMar>
+              <w:top w:w="120" w:type="dxa"/>
+              <w:bottom w:w="120" w:type="dxa"/>
+              <w:left w:w="180" w:type="dxa"/>
+              <w:right w:w="180" w:type="dxa"/>
+            </w:tcMar>
+          </w:tcPr>
+          <w:p>
+            <w:pPr>
+              <w:spacing w:after="40"/>
+            </w:pPr>
+            <w:r>
+              <w:rPr>
+                <w:sz w:val="19"/>
+              </w:rPr>
+              <w:t>administracion@hotelguadiana.es (Bandeja de Isabel - Conciliación contable)</w:t>
             </w:r>
           </w:p>
         </w:tc>
@@ -371,180 +423,142 @@
         <w:spacing w:after="120"/>
       </w:pPr>
     </w:p>
-    <w:p>
-      <w:r>
-        <w:rPr>
-          <w:b/>
-          <w:color w:val="B91C1C"/>
-          <w:sz w:val="26"/>
-        </w:rPr>
-        <w:t>2. SEGURIDAD TOTAL: ¿POR QUÉ ES VITAL UTILIZAR EL ENLACE PAYGOLD?</w:t>
-      </w:r>
-    </w:p>
-    <w:p>
-      <w:pPr>
-        <w:spacing w:after="80"/>
-        <w:ind w:left="288"/>
-      </w:pPr>
-      <w:r>
-        <w:rPr>
-          <w:b/>
-          <w:color w:val="1E293B"/>
-          <w:sz w:val="20"/>
-        </w:rPr>
-        <w:t xml:space="preserve">🛡️ Cero Riesgo de Filtraciones Internas o Externas: </w:t>
-      </w:r>
-      <w:r>
-        <w:rPr>
-          <w:color w:val="475569"/>
-          <w:sz w:val="19"/>
-        </w:rPr>
-        <w:t>NUNCA se deben apuntar números de tarjeta de 16 dígitos ni códigos CVV en el recuadro 'Observaciones', ni en papeles ni en notas adhesivas. Si el sistema o un bloc sufrieran una filtración o inspección, almacenar tarjetas en texto plano acarrea multas de hasta el 4% de la facturación bajo el RGPD y sanciones bancarias directas de Visa/Mastercard de hasta 100.000€, además de la retirada del TPV.</w:t>
-      </w:r>
-    </w:p>
-    <w:p>
-      <w:pPr>
-        <w:spacing w:after="80"/>
-        <w:ind w:left="288"/>
-      </w:pPr>
-      <w:r>
-        <w:rPr>
-          <w:b/>
-          <w:color w:val="1E293B"/>
-          <w:sz w:val="20"/>
-        </w:rPr>
-        <w:t xml:space="preserve">🛡️ Blindaje contra Fraudes y Falsas Reclamaciones (3D Secure / PSD2): </w:t>
-      </w:r>
-      <w:r>
-        <w:rPr>
-          <w:color w:val="475569"/>
-          <w:sz w:val="19"/>
-        </w:rPr>
-        <w:t>Al pagar mediante el enlace de PayGold, el cliente debe validar la operación en su propio teléfono móvil (mediante Bizum o la app de su propio banco con huella digital, Face ID o SMS). Esta autenticación bancaria en dos pasos provoca el traspaso legal de responsabilidad (Liability Shift): el cliente NUNCA podrá repudiar el cobro diciendo 'yo no autoricé este cargo', garantizando el 100% del dinero para el hotel.</w:t>
-      </w:r>
-    </w:p>
-    <w:p>
-      <w:pPr>
-        <w:spacing w:after="80"/>
-        <w:ind w:left="288"/>
-      </w:pPr>
-      <w:r>
-        <w:rPr>
-          <w:b/>
-          <w:color w:val="1E293B"/>
-          <w:sz w:val="20"/>
-        </w:rPr>
-        <w:t xml:space="preserve">🛡️ Tranquilidad para el Personal de Recepción: </w:t>
-      </w:r>
-      <w:r>
-        <w:rPr>
-          <w:color w:val="475569"/>
-          <w:sz w:val="19"/>
-        </w:rPr>
-        <w:t>Al no manipular ni custodiar tarjetas completas de clientes, ningún recepcionista ni empleado puede ser objeto de sospecha ante cargos no reconocidos que el cliente sufra en otros comercios. El hotel solo almacena un código de pedido (GE-XXXXXX) y los últimos 4 dígitos como mera referencia visual.</w:t>
-      </w:r>
-    </w:p>
+    <w:tbl>
+      <w:tblPr>
+        <w:tblW w:type="auto" w:w="0"/>
+        <w:jc w:val="center"/>
+        <w:tblLook w:firstColumn="1" w:firstRow="1" w:lastColumn="0" w:lastRow="0" w:noHBand="0" w:noVBand="1" w:val="04A0"/>
+      </w:tblPr>
+      <w:tblGrid>
+        <w:gridCol w:w="9936"/>
+      </w:tblGrid>
+      <w:tr>
+        <w:tc>
+          <w:tcPr>
+            <w:tcW w:type="dxa" w:w="9792"/>
+            <w:shd w:fill="FEF2F2"/>
+            <w:tcMar>
+              <w:top w:w="140" w:type="dxa"/>
+              <w:bottom w:w="140" w:type="dxa"/>
+              <w:left w:w="180" w:type="dxa"/>
+              <w:right w:w="180" w:type="dxa"/>
+            </w:tcMar>
+          </w:tcPr>
+          <w:p>
+            <w:pPr>
+              <w:spacing w:after="40"/>
+            </w:pPr>
+            <w:r>
+              <w:rPr>
+                <w:b/>
+                <w:color w:val="991B1B"/>
+                <w:sz w:val="20"/>
+              </w:rPr>
+              <w:t>🛡️ NORMATIVA DE SEGURIDAD PCI-DSS OBLIGATORIA:</w:t>
+              <w:br/>
+            </w:r>
+            <w:r>
+              <w:rPr>
+                <w:color w:val="7F1D1D"/>
+                <w:sz w:val="19"/>
+              </w:rPr>
+              <w:t>Queda terminantemente prohibido teclear números de tarjeta completos de 16 dígitos en el recuadro de 'Observaciones'. Si el cliente facilita su tarjeta por teléfono, anota únicamente los últimos 4 dígitos (ej. 2525) en su casilla correspondiente. El pago oficial se realiza siempre mediante el enlace PayGold de Eurocaja Rural.</w:t>
+            </w:r>
+          </w:p>
+        </w:tc>
+      </w:tr>
+    </w:tbl>
     <w:p>
       <w:pPr>
         <w:spacing w:after="160"/>
       </w:pPr>
     </w:p>
     <w:p>
+      <w:pPr>
+        <w:pStyle w:val="Heading1"/>
+        <w:spacing w:before="240" w:after="120"/>
+      </w:pPr>
       <w:r>
         <w:rPr>
-          <w:b/>
-          <w:color w:val="15803D"/>
-          <w:sz w:val="26"/>
+          <w:color w:val="1E293B"/>
         </w:rPr>
-        <w:t>3. PROCEDIMIENTO OPERATIVO PASO A PASO</w:t>
+        <w:t>2. Procedimiento Paso a Paso</w:t>
       </w:r>
     </w:p>
     <w:p>
       <w:pPr>
-        <w:spacing w:before="240"/>
+        <w:pStyle w:val="Heading2"/>
+        <w:spacing w:before="200" w:after="80"/>
       </w:pPr>
       <w:r>
         <w:rPr>
-          <w:b/>
-          <w:color w:val="1E293B"/>
+          <w:color w:val="166534"/>
           <w:sz w:val="24"/>
         </w:rPr>
-        <w:t>[PASO 1] Apertura y Registro de la Ficha en MesaChef</w:t>
+        <w:t>PASO 1: Apertura de Ficha en MesaChef</w:t>
       </w:r>
     </w:p>
     <w:p>
       <w:pPr>
-        <w:spacing w:after="40" w:before="20"/>
-        <w:ind w:left="288"/>
+        <w:pStyle w:val="ListBullet"/>
+        <w:spacing w:before="20" w:after="40"/>
       </w:pPr>
       <w:r>
         <w:rPr>
+          <w:color w:val="334155"/>
           <w:sz w:val="19"/>
         </w:rPr>
-        <w:t>1. En MesaChef, entra en Grandes Eventos y localiza la reserva del cliente o pulsa en '+ Añadir Participante'.</w:t>
+        <w:t>Accede al módulo Grandes Eventos y pulsa '+ Añadir Participante' o busca la reserva existente.</w:t>
       </w:r>
     </w:p>
     <w:p>
       <w:pPr>
-        <w:spacing w:after="40" w:before="20"/>
-        <w:ind w:left="288"/>
+        <w:pStyle w:val="ListBullet"/>
+        <w:spacing w:before="20" w:after="40"/>
       </w:pPr>
       <w:r>
         <w:rPr>
+          <w:color w:val="334155"/>
           <w:sz w:val="19"/>
         </w:rPr>
-        <w:t>2. Rellena los datos: Nombre completo del titular, Teléfono móvil, Adultos y Niños.</w:t>
+        <w:t>Rellena: Nombre Titular, Teléfono (9 dígitos), Comensales (Adultos y Niños).</w:t>
       </w:r>
     </w:p>
     <w:p>
       <w:pPr>
-        <w:spacing w:after="40" w:before="20"/>
-        <w:ind w:left="288"/>
+        <w:pStyle w:val="ListBullet"/>
+        <w:spacing w:before="20" w:after="40"/>
       </w:pPr>
       <w:r>
         <w:rPr>
+          <w:color w:val="334155"/>
           <w:sz w:val="19"/>
         </w:rPr>
-        <w:t>3. En 'Fecha Cargo Previsto', indica la fecha límite pactada para este evento (ej. 28/12/2026).</w:t>
+        <w:t>Fecha Cargo Previsto: Selecciona la fecha pactada límite de pago (ej. 28/12/2026).</w:t>
       </w:r>
     </w:p>
     <w:p>
       <w:pPr>
-        <w:spacing w:after="40" w:before="20"/>
-        <w:ind w:left="288"/>
+        <w:pStyle w:val="ListBullet"/>
+        <w:spacing w:before="20" w:after="40"/>
       </w:pPr>
       <w:r>
         <w:rPr>
+          <w:color w:val="334155"/>
           <w:sz w:val="19"/>
         </w:rPr>
-        <w:t>4. Observa el 'Cód. Pedido PayGold' generado automáticamente (ej. GE-232078).</w:t>
+        <w:t>MesaChef genera automáticamente un Código de Pedido único (ej. GE-232078).</w:t>
       </w:r>
     </w:p>
     <w:p>
       <w:pPr>
-        <w:spacing w:after="40" w:before="20"/>
-        <w:ind w:left="288"/>
-      </w:pPr>
-      <w:r>
-        <w:rPr>
-          <w:b/>
-          <w:color w:val="B91C1C"/>
-          <w:sz w:val="19"/>
-        </w:rPr>
-        <w:t>REGLA DE SEGURIDAD: NUNCA escribir tarjetas de crédito completas de 16 dígitos en las Observaciones. Si el cliente la facilita por teléfono, anota únicamente los últimos 4 dígitos (ej. 2525) en su casilla correspondiente.</w:t>
-      </w:r>
-    </w:p>
-    <w:p>
-      <w:pPr>
-        <w:spacing w:before="120" w:after="160"/>
+        <w:spacing w:before="120" w:after="40"/>
         <w:jc w:val="center"/>
       </w:pPr>
-    </w:p>
-    <w:p>
       <w:r>
         <w:drawing>
           <wp:inline xmlns:a="http://schemas.openxmlformats.org/drawingml/2006/main" xmlns:pic="http://schemas.openxmlformats.org/drawingml/2006/picture">
-            <wp:extent cx="5303520" cy="3542586"/>
+            <wp:extent cx="5029200" cy="3359348"/>
             <wp:docPr id="1" name="Picture 1"/>
             <wp:cNvGraphicFramePr>
               <a:graphicFrameLocks noChangeAspect="1"/>
@@ -565,7 +579,7 @@
                   <pic:spPr>
                     <a:xfrm>
                       <a:off x="0" y="0"/>
-                      <a:ext cx="5303520" cy="3542586"/>
+                      <a:ext cx="5029200" cy="3359348"/>
                     </a:xfrm>
                     <a:prstGeom prst="rect"/>
                   </pic:spPr>
@@ -578,6 +592,7 @@
     </w:p>
     <w:p>
       <w:pPr>
+        <w:spacing w:after="200"/>
         <w:jc w:val="center"/>
       </w:pPr>
       <w:r>
@@ -586,93 +601,70 @@
           <w:color w:val="64748B"/>
           <w:sz w:val="17"/>
         </w:rPr>
-        <w:t>Ilustración PASO 1: Apertura y Registro de la Ficha en MesaChef</w:t>
+        <w:t>Figura 1: Ficha del participante en MesaChef con bloque seguro PayGold</w:t>
       </w:r>
     </w:p>
     <w:p>
       <w:pPr>
-        <w:spacing w:before="240"/>
+        <w:pStyle w:val="Heading2"/>
+        <w:spacing w:before="200" w:after="80"/>
       </w:pPr>
       <w:r>
         <w:rPr>
-          <w:b/>
-          <w:color w:val="1E293B"/>
+          <w:color w:val="166534"/>
           <w:sz w:val="24"/>
         </w:rPr>
-        <w:t>[PASO 2] Acceso al Portal TPV Virtual de Eurocaja Rural</w:t>
+        <w:t>PASO 2: Acceso al TPV Virtual de Eurocaja Rural</w:t>
       </w:r>
     </w:p>
     <w:p>
       <w:pPr>
-        <w:spacing w:after="40" w:before="20"/>
-        <w:ind w:left="288"/>
+        <w:pStyle w:val="ListBullet"/>
+        <w:spacing w:before="20" w:after="40"/>
       </w:pPr>
       <w:r>
         <w:rPr>
+          <w:color w:val="334155"/>
           <w:sz w:val="19"/>
         </w:rPr>
-        <w:t>1. En la ficha de MesaChef, haz clic en el enlace azul: '🌐 Abrir TPV Eurocaja Rural'.</w:t>
+        <w:t>En la ficha de MesaChef, pulsa el enlace 'Abrir TPV Eurocaja Rural' (https://canales.redsys.es/portal).</w:t>
       </w:r>
     </w:p>
     <w:p>
       <w:pPr>
-        <w:spacing w:after="40" w:before="20"/>
-        <w:ind w:left="288"/>
+        <w:pStyle w:val="ListBullet"/>
+        <w:spacing w:before="20" w:after="40"/>
       </w:pPr>
       <w:r>
         <w:rPr>
+          <w:color w:val="334155"/>
           <w:sz w:val="19"/>
         </w:rPr>
-        <w:t>2. En la pantalla de bienvenida de Redsys Eurocaja introduce:</w:t>
+        <w:t>Usuario: 168355840-001 (muy importante incluir el terminal -001).</w:t>
       </w:r>
     </w:p>
     <w:p>
       <w:pPr>
-        <w:spacing w:after="40" w:before="20"/>
-        <w:ind w:left="288"/>
+        <w:pStyle w:val="ListBullet"/>
+        <w:spacing w:before="20" w:after="40"/>
       </w:pPr>
       <w:r>
         <w:rPr>
+          <w:color w:val="334155"/>
           <w:sz w:val="19"/>
         </w:rPr>
-        <w:t xml:space="preserve">   • Usuario: 168355840-001 (imprescindible escribir el guion y el 001).</w:t>
+        <w:t>Contraseña: Tu clave oficial del TPV de recepción y pulsa Aceptar.</w:t>
       </w:r>
     </w:p>
     <w:p>
       <w:pPr>
-        <w:spacing w:after="40" w:before="20"/>
-        <w:ind w:left="288"/>
-      </w:pPr>
-      <w:r>
-        <w:rPr>
-          <w:sz w:val="19"/>
-        </w:rPr>
-        <w:t xml:space="preserve">   • Contraseña: La clave de acceso del TPV asignada a recepción.</w:t>
-      </w:r>
-    </w:p>
-    <w:p>
-      <w:pPr>
-        <w:spacing w:after="40" w:before="20"/>
-        <w:ind w:left="288"/>
-      </w:pPr>
-      <w:r>
-        <w:rPr>
-          <w:sz w:val="19"/>
-        </w:rPr>
-        <w:t>3. Pulsa el botón naranja 'Aceptar'.</w:t>
-      </w:r>
-    </w:p>
-    <w:p>
-      <w:pPr>
-        <w:spacing w:before="120" w:after="160"/>
+        <w:spacing w:before="120" w:after="40"/>
         <w:jc w:val="center"/>
       </w:pPr>
-    </w:p>
-    <w:p>
       <w:r>
         <w:drawing>
           <wp:inline xmlns:a="http://schemas.openxmlformats.org/drawingml/2006/main" xmlns:pic="http://schemas.openxmlformats.org/drawingml/2006/picture">
-            <wp:extent cx="3291840" cy="2634724"/>
+            <wp:extent cx="5029200" cy="4025272"/>
             <wp:docPr id="2" name="Picture 2"/>
             <wp:cNvGraphicFramePr>
               <a:graphicFrameLocks noChangeAspect="1"/>
@@ -693,7 +685,7 @@
                   <pic:spPr>
                     <a:xfrm>
                       <a:off x="0" y="0"/>
-                      <a:ext cx="3291840" cy="2634724"/>
+                      <a:ext cx="5029200" cy="4025272"/>
                     </a:xfrm>
                     <a:prstGeom prst="rect"/>
                   </pic:spPr>
@@ -706,6 +698,7 @@
     </w:p>
     <w:p>
       <w:pPr>
+        <w:spacing w:after="200"/>
         <w:jc w:val="center"/>
       </w:pPr>
       <w:r>
@@ -714,131 +707,109 @@
           <w:color w:val="64748B"/>
           <w:sz w:val="17"/>
         </w:rPr>
-        <w:t>Ilustración PASO 2: Acceso al Portal TPV Virtual de Eurocaja Rural</w:t>
+        <w:t>Figura 2: Pantalla oficial de autenticación en Redsys Canales (Eurocaja Rural)</w:t>
       </w:r>
     </w:p>
     <w:p>
       <w:pPr>
-        <w:spacing w:before="240"/>
+        <w:pStyle w:val="Heading2"/>
+        <w:spacing w:before="200" w:after="80"/>
       </w:pPr>
       <w:r>
         <w:rPr>
-          <w:b/>
-          <w:color w:val="1E293B"/>
+          <w:color w:val="166534"/>
           <w:sz w:val="24"/>
         </w:rPr>
-        <w:t>[PASO 3] Generación del Enlace de Cobro PayGold en Eurocaja</w:t>
+        <w:t>PASO 3: Generación del Enlace PayGold en Eurocaja</w:t>
       </w:r>
     </w:p>
     <w:p>
       <w:pPr>
-        <w:spacing w:after="40" w:before="20"/>
-        <w:ind w:left="288"/>
+        <w:pStyle w:val="ListBullet"/>
+        <w:spacing w:before="20" w:after="40"/>
       </w:pPr>
       <w:r>
         <w:rPr>
+          <w:color w:val="334155"/>
           <w:sz w:val="19"/>
         </w:rPr>
-        <w:t>1. En el menú de la izquierda de Eurocaja, pulsa en el botón verde 'PayGold' (icono de tarjeta con flecha).</w:t>
+        <w:t>En el menú lateral izquierdo de Eurocaja, haz clic en PayGold (icono verde con tarjeta).</w:t>
       </w:r>
     </w:p>
     <w:p>
       <w:pPr>
-        <w:spacing w:after="40" w:before="20"/>
-        <w:ind w:left="288"/>
+        <w:pStyle w:val="ListBullet"/>
+        <w:spacing w:before="20" w:after="40"/>
       </w:pPr>
       <w:r>
         <w:rPr>
+          <w:color w:val="334155"/>
           <w:sz w:val="19"/>
         </w:rPr>
-        <w:t>2. Rellena las casillas usando los botones de copia rápida de MesaChef:</w:t>
+        <w:t>Código de pedido: Pulsa 'Copiar' en MesaChef y pégalo aquí (Ctrl+V) -&gt; Ej: GE-232078.</w:t>
       </w:r>
     </w:p>
     <w:p>
       <w:pPr>
-        <w:spacing w:after="40" w:before="20"/>
-        <w:ind w:left="288"/>
+        <w:pStyle w:val="ListBullet"/>
+        <w:spacing w:before="20" w:after="40"/>
       </w:pPr>
       <w:r>
         <w:rPr>
+          <w:color w:val="334155"/>
           <w:sz w:val="19"/>
         </w:rPr>
-        <w:t xml:space="preserve">   • Código de pedido: Pulsa '📋 Copiar' en MesaChef y pégalo aquí (Ctrl + V).</w:t>
+        <w:t>Importe: Pulsa 'Copiar Importe' en MesaChef y pégalo aquí (Ctrl+V) -&gt; Ej: 120.00.</w:t>
       </w:r>
     </w:p>
     <w:p>
       <w:pPr>
-        <w:spacing w:after="40" w:before="20"/>
-        <w:ind w:left="288"/>
+        <w:pStyle w:val="ListBullet"/>
+        <w:spacing w:before="20" w:after="40"/>
       </w:pPr>
       <w:r>
         <w:rPr>
+          <w:color w:val="334155"/>
           <w:sz w:val="19"/>
         </w:rPr>
-        <w:t xml:space="preserve">   • Importe (N.NN): Pulsa '💰 Copiar Importe' en MesaChef y pégalo aquí (Ctrl + V).</w:t>
+        <w:t>Descripción: Pulsa 'Copiar Descripción' en MesaChef y pégalo aquí -&gt; Ej: Cena Fin de año 2026 en Sercotel Guadiana - Juan Pérez.</w:t>
       </w:r>
     </w:p>
     <w:p>
       <w:pPr>
-        <w:spacing w:after="40" w:before="20"/>
-        <w:ind w:left="288"/>
+        <w:pStyle w:val="ListBullet"/>
+        <w:spacing w:before="20" w:after="40"/>
       </w:pPr>
       <w:r>
         <w:rPr>
+          <w:color w:val="334155"/>
           <w:sz w:val="19"/>
         </w:rPr>
-        <w:t xml:space="preserve">   • Descripción: Pulsa '📝 Copiar Descripción' en MesaChef y pégalo aquí (Ctrl + V). Sigue el formato: Cena Fin de año - [Nombre Cliente].</w:t>
+        <w:t>Caducidad del enlace (OBLIGATORIO): Marca 'Hora exacta' e introduce la misma fecha límite del evento (ej. 28-12-2026 23:59). NUNCA dejar las 24 horas por defecto.</w:t>
       </w:r>
     </w:p>
     <w:p>
       <w:pPr>
-        <w:spacing w:after="40" w:before="20"/>
-        <w:ind w:left="288"/>
+        <w:pStyle w:val="ListBullet"/>
+        <w:spacing w:before="20" w:after="40"/>
       </w:pPr>
       <w:r>
         <w:rPr>
-          <w:b/>
-          <w:color w:val="B91C1C"/>
+          <w:color w:val="334155"/>
           <w:sz w:val="19"/>
         </w:rPr>
-        <w:t>3. CADUCIDAD DEL ENLACE (OBLIGATORIO): Marca la opción 'Hora exacta' e introduce EXACTAMENTE la misma Fecha Límite de Pago fijada en MesaChef para este evento (ej. Fecha: 28-12-2026, Hora: 23:59). NUNCA dejar las 24 horas por defecto.</w:t>
+        <w:t>Pulsa Aceptar / Enviar y copia el enlace seguro generado (https://sis.redsys.es/sis/p2f?t=...).</w:t>
       </w:r>
     </w:p>
     <w:p>
       <w:pPr>
-        <w:spacing w:after="40" w:before="20"/>
-        <w:ind w:left="288"/>
-      </w:pPr>
-      <w:r>
-        <w:rPr>
-          <w:sz w:val="19"/>
-        </w:rPr>
-        <w:t>4. Pulsa 'Aceptar / Enviar': el banco facilitará el enlace seguro (https://sis.redsys.es/sis/p2f?t=...).</w:t>
-      </w:r>
-    </w:p>
-    <w:p>
-      <w:pPr>
-        <w:spacing w:after="40" w:before="20"/>
-        <w:ind w:left="288"/>
-      </w:pPr>
-      <w:r>
-        <w:rPr>
-          <w:sz w:val="19"/>
-        </w:rPr>
-        <w:t>5. Copia ese enlace oficial generado.</w:t>
-      </w:r>
-    </w:p>
-    <w:p>
-      <w:pPr>
-        <w:spacing w:before="120" w:after="160"/>
+        <w:spacing w:before="120" w:after="40"/>
         <w:jc w:val="center"/>
       </w:pPr>
-    </w:p>
-    <w:p>
       <w:r>
         <w:drawing>
           <wp:inline xmlns:a="http://schemas.openxmlformats.org/drawingml/2006/main" xmlns:pic="http://schemas.openxmlformats.org/drawingml/2006/picture">
-            <wp:extent cx="4937760" cy="4509063"/>
+            <wp:extent cx="5029200" cy="4592564"/>
             <wp:docPr id="3" name="Picture 3"/>
             <wp:cNvGraphicFramePr>
               <a:graphicFrameLocks noChangeAspect="1"/>
@@ -859,7 +830,7 @@
                   <pic:spPr>
                     <a:xfrm>
                       <a:off x="0" y="0"/>
-                      <a:ext cx="4937760" cy="4509063"/>
+                      <a:ext cx="5029200" cy="4592564"/>
                     </a:xfrm>
                     <a:prstGeom prst="rect"/>
                   </pic:spPr>
@@ -872,6 +843,7 @@
     </w:p>
     <w:p>
       <w:pPr>
+        <w:spacing w:after="200"/>
         <w:jc w:val="center"/>
       </w:pPr>
       <w:r>
@@ -880,129 +852,83 @@
           <w:color w:val="64748B"/>
           <w:sz w:val="17"/>
         </w:rPr>
-        <w:t>Ilustración PASO 3: Generación del Enlace de Cobro PayGold en Eurocaja</w:t>
+        <w:t>Figura 3: Formulario PayGold en Eurocaja Rural con importe y fecha límite exacta</w:t>
       </w:r>
     </w:p>
     <w:p>
       <w:pPr>
-        <w:spacing w:before="240"/>
+        <w:pStyle w:val="Heading2"/>
+        <w:spacing w:before="200" w:after="80"/>
       </w:pPr>
       <w:r>
         <w:rPr>
-          <w:b/>
-          <w:color w:val="1E293B"/>
+          <w:color w:val="166534"/>
           <w:sz w:val="24"/>
         </w:rPr>
-        <w:t>[PASO 4] Envío del WhatsApp con Enlace y Cláusula de Cancelación</w:t>
+        <w:t>PASO 4: Envío del WhatsApp de Confirmación al Cliente</w:t>
       </w:r>
     </w:p>
     <w:p>
       <w:pPr>
-        <w:spacing w:after="40" w:before="20"/>
-        <w:ind w:left="288"/>
+        <w:pStyle w:val="ListBullet"/>
+        <w:spacing w:before="20" w:after="40"/>
       </w:pPr>
       <w:r>
         <w:rPr>
+          <w:color w:val="334155"/>
           <w:sz w:val="19"/>
         </w:rPr>
-        <w:t>1. Vuelve a la ficha de MesaChef y pega el enlace en 'Enlace PayGold generado en Eurocaja (Obligatorio para WhatsApp)'.</w:t>
+        <w:t>Vuelve a la ficha de MesaChef y pega el enlace en: 'Enlace PayGold generado en Eurocaja'.</w:t>
       </w:r>
     </w:p>
     <w:p>
       <w:pPr>
-        <w:spacing w:after="40" w:before="20"/>
-        <w:ind w:left="288"/>
+        <w:pStyle w:val="ListBullet"/>
+        <w:spacing w:before="20" w:after="40"/>
       </w:pPr>
       <w:r>
         <w:rPr>
+          <w:color w:val="334155"/>
           <w:sz w:val="19"/>
         </w:rPr>
-        <w:t>2. Haz clic en el botón verde: '📱 WhatsApp PayGold'.</w:t>
+        <w:t>Haz clic en el botón verde: 'WhatsApp PayGold'.</w:t>
       </w:r>
     </w:p>
     <w:p>
       <w:pPr>
-        <w:spacing w:after="40" w:before="20"/>
-        <w:ind w:left="288"/>
+        <w:pStyle w:val="ListBullet"/>
+        <w:spacing w:before="20" w:after="40"/>
       </w:pPr>
       <w:r>
         <w:rPr>
+          <w:color w:val="334155"/>
           <w:sz w:val="19"/>
         </w:rPr>
-        <w:t>3. Se abrirá WhatsApp con el mensaje oficial redactado automáticamente que incluye:</w:t>
+        <w:t>Se abre WhatsApp Web con el mensaje redactado automáticamente con el enlace seguro y la cláusula legal de no reembolso si no se abona antes de la fecha límite.</w:t>
       </w:r>
     </w:p>
     <w:p>
       <w:pPr>
-        <w:spacing w:after="40" w:before="20"/>
-        <w:ind w:left="288"/>
+        <w:pStyle w:val="ListBullet"/>
+        <w:spacing w:before="20" w:after="40"/>
       </w:pPr>
       <w:r>
         <w:rPr>
+          <w:color w:val="334155"/>
           <w:sz w:val="19"/>
         </w:rPr>
-        <w:t xml:space="preserve">   • Nombre del cliente y evento oficial (Cena Fin de año 2026 en Sercotel Guadiana).</w:t>
+        <w:t>Envía el mensaje al cliente y pulsa 'Guardar Ficha'. El estado pasará a 'Enlace Enviado'.</w:t>
       </w:r>
     </w:p>
     <w:p>
       <w:pPr>
-        <w:spacing w:after="40" w:before="20"/>
-        <w:ind w:left="288"/>
-      </w:pPr>
-      <w:r>
-        <w:rPr>
-          <w:sz w:val="19"/>
-        </w:rPr>
-        <w:t xml:space="preserve">   • Desglose de comensales e importes (total y pendiente).</w:t>
-      </w:r>
-    </w:p>
-    <w:p>
-      <w:pPr>
-        <w:spacing w:after="40" w:before="20"/>
-        <w:ind w:left="288"/>
-      </w:pPr>
-      <w:r>
-        <w:rPr>
-          <w:sz w:val="19"/>
-        </w:rPr>
-        <w:t xml:space="preserve">   • Enlace oficial de Eurocaja Rural para abonar por Bizum o Tarjeta.</w:t>
-      </w:r>
-    </w:p>
-    <w:p>
-      <w:pPr>
-        <w:spacing w:after="40" w:before="20"/>
-        <w:ind w:left="288"/>
-      </w:pPr>
-      <w:r>
-        <w:rPr>
-          <w:sz w:val="19"/>
-        </w:rPr>
-        <w:t xml:space="preserve">   • Cláusula de cancelación estricta: 'A partir de esta fecha la cantidad será no reembolsable. Si el pago no se recibe en esta fecha, su reserva será cancelada por falta de pago.'</w:t>
-      </w:r>
-    </w:p>
-    <w:p>
-      <w:pPr>
-        <w:spacing w:after="40" w:before="20"/>
-        <w:ind w:left="288"/>
-      </w:pPr>
-      <w:r>
-        <w:rPr>
-          <w:sz w:val="19"/>
-        </w:rPr>
-        <w:t>4. Envía el mensaje al cliente y pulsa 'Guardar Ficha' en MesaChef. El estado cambiará a '📤 Enlace Enviado'.</w:t>
-      </w:r>
-    </w:p>
-    <w:p>
-      <w:pPr>
-        <w:spacing w:before="120" w:after="160"/>
+        <w:spacing w:before="120" w:after="40"/>
         <w:jc w:val="center"/>
       </w:pPr>
-    </w:p>
-    <w:p>
       <w:r>
         <w:drawing>
           <wp:inline xmlns:a="http://schemas.openxmlformats.org/drawingml/2006/main" xmlns:pic="http://schemas.openxmlformats.org/drawingml/2006/picture">
-            <wp:extent cx="4754880" cy="3276151"/>
+            <wp:extent cx="5029200" cy="3465159"/>
             <wp:docPr id="4" name="Picture 4"/>
             <wp:cNvGraphicFramePr>
               <a:graphicFrameLocks noChangeAspect="1"/>
@@ -1023,7 +949,7 @@
                   <pic:spPr>
                     <a:xfrm>
                       <a:off x="0" y="0"/>
-                      <a:ext cx="4754880" cy="3276151"/>
+                      <a:ext cx="5029200" cy="3465159"/>
                     </a:xfrm>
                     <a:prstGeom prst="rect"/>
                   </pic:spPr>
@@ -1036,6 +962,7 @@
     </w:p>
     <w:p>
       <w:pPr>
+        <w:spacing w:after="200"/>
         <w:jc w:val="center"/>
       </w:pPr>
       <w:r>
@@ -1044,129 +971,96 @@
           <w:color w:val="64748B"/>
           <w:sz w:val="17"/>
         </w:rPr>
-        <w:t>Ilustración PASO 4: Envío del WhatsApp con Enlace y Cláusula de Cancelación</w:t>
+        <w:t>Figura 4: Mensaje oficial de WhatsApp con enlace PayGold y condiciones de cancelación</w:t>
       </w:r>
     </w:p>
     <w:p>
       <w:pPr>
-        <w:spacing w:before="240"/>
+        <w:pStyle w:val="Heading2"/>
+        <w:spacing w:before="200" w:after="80"/>
       </w:pPr>
       <w:r>
         <w:rPr>
-          <w:b/>
-          <w:color w:val="1E293B"/>
+          <w:color w:val="166534"/>
           <w:sz w:val="24"/>
         </w:rPr>
-        <w:t>[PASO 5] Confirmación del Cobro y Circuito con Isabel (Administración)</w:t>
+        <w:t>PASO 5: Sincronización Automática (Webhook) y Conciliación con Isabel</w:t>
       </w:r>
     </w:p>
     <w:p>
       <w:pPr>
-        <w:spacing w:after="40" w:before="20"/>
-        <w:ind w:left="288"/>
+        <w:pStyle w:val="ListBullet"/>
+        <w:spacing w:before="20" w:after="40"/>
       </w:pPr>
       <w:r>
         <w:rPr>
+          <w:color w:val="334155"/>
           <w:sz w:val="19"/>
         </w:rPr>
-        <w:t>1. Cuando el cliente completa el abono en el enlace del banco, Eurocaja envía un email automático con el justificante y número de pedido.</w:t>
+        <w:t>⚡ Sincronización Automática en Tiempo Real: En cuanto el cliente paga desde su móvil (Bizum o Tarjeta), Redsys notifica al Webhook de MesaChef.</w:t>
       </w:r>
     </w:p>
     <w:p>
       <w:pPr>
-        <w:spacing w:after="40" w:before="20"/>
-        <w:ind w:left="288"/>
+        <w:pStyle w:val="ListBullet"/>
+        <w:spacing w:before="20" w:after="40"/>
       </w:pPr>
       <w:r>
         <w:rPr>
+          <w:color w:val="334155"/>
           <w:sz w:val="19"/>
         </w:rPr>
-        <w:t>2. Este correo llega a la bandeja de Isabel: administracion@hotelguadiana.es.</w:t>
+        <w:t>MesaChef actualiza la ficha solo: Cambia a '✅ Garantizado / Pagado', anota el pago con su código de autorización en el historial y guarda los últimos 4 dígitos.</w:t>
       </w:r>
     </w:p>
     <w:p>
       <w:pPr>
-        <w:spacing w:after="40" w:before="20"/>
-        <w:ind w:left="288"/>
+        <w:pStyle w:val="ListBullet"/>
+        <w:spacing w:before="20" w:after="40"/>
       </w:pPr>
       <w:r>
         <w:rPr>
+          <w:color w:val="334155"/>
           <w:sz w:val="19"/>
         </w:rPr>
-        <w:t>3. Isabel comprueba la entrada del dinero y REENVÍA el correo a Recepción para su control operativo.</w:t>
+        <w:t>Recepción no necesita hacer nada a mano: la reserva se pone en verde al segundo.</w:t>
       </w:r>
     </w:p>
     <w:p>
       <w:pPr>
-        <w:spacing w:after="40" w:before="20"/>
-        <w:ind w:left="288"/>
+        <w:pStyle w:val="ListBullet"/>
+        <w:spacing w:before="20" w:after="40"/>
       </w:pPr>
       <w:r>
         <w:rPr>
+          <w:color w:val="334155"/>
           <w:sz w:val="19"/>
         </w:rPr>
-        <w:t>4. En cuanto Recepción recibe el email de Isabel:</w:t>
+        <w:t>📑 Conciliación Contable (Isabel): Paralelamente el justificante oficial llega al email administracion@hotelguadiana.es (Isabel) para la cuadratura contable y extractos mensuales.</w:t>
       </w:r>
     </w:p>
     <w:p>
       <w:pPr>
-        <w:spacing w:after="40" w:before="20"/>
-        <w:ind w:left="288"/>
+        <w:pStyle w:val="ListBullet"/>
+        <w:spacing w:before="20" w:after="40"/>
       </w:pPr>
       <w:r>
         <w:rPr>
+          <w:color w:val="334155"/>
           <w:sz w:val="19"/>
         </w:rPr>
-        <w:t xml:space="preserve">   • Abre la ficha del participante en MesaChef.</w:t>
+        <w:t>Recepción ya no tiene que esperar a que Isabel reenvíe el correo para considerar la reserva formalizada.</w:t>
       </w:r>
     </w:p>
     <w:p>
       <w:pPr>
-        <w:spacing w:after="40" w:before="20"/>
-        <w:ind w:left="288"/>
-      </w:pPr>
-      <w:r>
-        <w:rPr>
-          <w:sz w:val="19"/>
-        </w:rPr>
-        <w:t xml:space="preserve">   • En 'Historial de Pagos', anota el importe y pulsa '+ Añadir'.</w:t>
-      </w:r>
-    </w:p>
-    <w:p>
-      <w:pPr>
-        <w:spacing w:after="40" w:before="20"/>
-        <w:ind w:left="288"/>
-      </w:pPr>
-      <w:r>
-        <w:rPr>
-          <w:sz w:val="19"/>
-        </w:rPr>
-        <w:t xml:space="preserve">   • Cambia el 'Estado Garantía' a: '✅ Garantizado / Pagado'.</w:t>
-      </w:r>
-    </w:p>
-    <w:p>
-      <w:pPr>
-        <w:spacing w:after="40" w:before="20"/>
-        <w:ind w:left="288"/>
-      </w:pPr>
-      <w:r>
-        <w:rPr>
-          <w:sz w:val="19"/>
-        </w:rPr>
-        <w:t xml:space="preserve">   • Pulsa 'Guardar Ficha'. ¡La plaza queda 100% blindada!</w:t>
-      </w:r>
-    </w:p>
-    <w:p>
-      <w:pPr>
-        <w:spacing w:before="120" w:after="160"/>
+        <w:spacing w:before="120" w:after="40"/>
         <w:jc w:val="center"/>
       </w:pPr>
-    </w:p>
-    <w:p>
       <w:r>
         <w:drawing>
           <wp:inline xmlns:a="http://schemas.openxmlformats.org/drawingml/2006/main" xmlns:pic="http://schemas.openxmlformats.org/drawingml/2006/picture">
-            <wp:extent cx="4937760" cy="935396"/>
+            <wp:extent cx="5029200" cy="952718"/>
             <wp:docPr id="5" name="Picture 5"/>
             <wp:cNvGraphicFramePr>
               <a:graphicFrameLocks noChangeAspect="1"/>
@@ -1187,7 +1081,7 @@
                   <pic:spPr>
                     <a:xfrm>
                       <a:off x="0" y="0"/>
-                      <a:ext cx="4937760" cy="935396"/>
+                      <a:ext cx="5029200" cy="952718"/>
                     </a:xfrm>
                     <a:prstGeom prst="rect"/>
                   </pic:spPr>
@@ -1200,6 +1094,7 @@
     </w:p>
     <w:p>
       <w:pPr>
+        <w:spacing w:after="200"/>
         <w:jc w:val="center"/>
       </w:pPr>
       <w:r>
@@ -1208,12 +1103,25 @@
           <w:color w:val="64748B"/>
           <w:sz w:val="17"/>
         </w:rPr>
-        <w:t>Ilustración PASO 5: Confirmación del Cobro y Circuito con Isabel (Administración)</w:t>
+        <w:t>Figura 5: Justificante oficial de cobro recibido por Isabel en administración</w:t>
+      </w:r>
+    </w:p>
+    <w:p>
+      <w:pPr>
+        <w:spacing w:before="320"/>
+        <w:jc w:val="center"/>
+      </w:pPr>
+      <w:r>
+        <w:rPr>
+          <w:color w:val="94A3B8"/>
+          <w:sz w:val="17"/>
+        </w:rPr>
+        <w:t>MesaChef Matrix v10.3.0 • Sercotel Hotel Guadiana • Dpto. de Recepción &amp; Administración</w:t>
       </w:r>
     </w:p>
     <w:sectPr>
       <w:pgSz w:w="12240" w:h="15840"/>
-      <w:pgMar w:top="1080" w:right="1152" w:bottom="1080" w:left="1152" w:header="720" w:footer="720" w:gutter="0"/>
+      <w:pgMar w:top="1152" w:right="1152" w:bottom="1152" w:left="1152" w:header="720" w:footer="720" w:gutter="0"/>
       <w:cols w:space="720"/>
       <w:docGrid w:linePitch="360"/>
     </w:sectPr>

</xml_diff>

<commit_message>
docs: incorporar bloque de novedades y version oficial v10.3.3 en todos los manuales
</commit_message>
<xml_diff>
--- a/MANUAL_RECEPCION_PAYGOLD_GUADIANA.docx
+++ b/MANUAL_RECEPCION_PAYGOLD_GUADIANA.docx
@@ -28,15 +28,178 @@
     </w:p>
     <w:p>
       <w:pPr>
-        <w:spacing w:after="280"/>
+        <w:spacing w:after="200"/>
       </w:pPr>
       <w:r>
         <w:rPr>
           <w:color w:val="475569"/>
-          <w:sz w:val="21"/>
+          <w:sz w:val="20"/>
         </w:rPr>
-        <w:t>Procedimiento oficial para registrar reservas en MesaChef Matrix v10.3.0, generar enlaces bancarios seguros en Eurocaja Rural (Redsys PayGold), enviar confirmaciones con cláusula de cancelación por WhatsApp, la sincronización automática online mediante Webhook y la conciliación contable con Administración.</w:t>
+        <w:t>Procedimiento oficial para registrar reservas en MesaChef Matrix v10.3.3, generar enlaces bancarios seguros en Eurocaja Rural (Redsys PayGold), configurar la URL de notificación online automática, enviar confirmaciones con cláusula de cancelación por WhatsApp, la sincronización automática en tiempo real y la conciliación contable con Administración.</w:t>
       </w:r>
+    </w:p>
+    <w:tbl>
+      <w:tblPr>
+        <w:tblW w:type="auto" w:w="0"/>
+        <w:jc w:val="center"/>
+        <w:tblLook w:firstColumn="1" w:firstRow="1" w:lastColumn="0" w:lastRow="0" w:noHBand="0" w:noVBand="1" w:val="04A0"/>
+      </w:tblPr>
+      <w:tblGrid>
+        <w:gridCol w:w="9936"/>
+      </w:tblGrid>
+      <w:tr>
+        <w:tc>
+          <w:tcPr>
+            <w:tcW w:type="dxa" w:w="9792"/>
+            <w:shd w:fill="F0F9FF"/>
+            <w:tcMar>
+              <w:top w:w="140" w:type="dxa"/>
+              <w:bottom w:w="140" w:type="dxa"/>
+              <w:left w:w="180" w:type="dxa"/>
+              <w:right w:w="180" w:type="dxa"/>
+            </w:tcMar>
+          </w:tcPr>
+          <w:p>
+            <w:pPr>
+              <w:spacing w:after="80"/>
+            </w:pPr>
+            <w:r>
+              <w:rPr>
+                <w:b/>
+                <w:color w:val="0369A1"/>
+                <w:sz w:val="20"/>
+              </w:rPr>
+              <w:t>✨ NOVEDADES RECIENTES DE ESTA VERSIÓN (MANUAL v10.3.3 • 28/10/2026):</w:t>
+              <w:br/>
+            </w:r>
+          </w:p>
+          <w:p>
+            <w:pPr>
+              <w:spacing w:before="20" w:after="40"/>
+            </w:pPr>
+            <w:r>
+              <w:rPr>
+                <w:b/>
+                <w:color w:val="0F172A"/>
+                <w:sz w:val="18"/>
+              </w:rPr>
+              <w:t>• ⚡ Notificación Automática Online (Webhook):</w:t>
+            </w:r>
+            <w:r>
+              <w:rPr>
+                <w:color w:val="334155"/>
+                <w:sz w:val="18"/>
+              </w:rPr>
+              <w:t xml:space="preserve"> Eurocaja Redsys actualiza la reserva a 🟢 Garantizado en vivo sin esperar al email.</w:t>
+            </w:r>
+          </w:p>
+          <w:p>
+            <w:pPr>
+              <w:spacing w:before="20" w:after="40"/>
+            </w:pPr>
+            <w:r>
+              <w:rPr>
+                <w:b/>
+                <w:color w:val="0F172A"/>
+                <w:sz w:val="18"/>
+              </w:rPr>
+              <w:t>• 📍 Captura Oficial del TPV (Paso 5):</w:t>
+            </w:r>
+            <w:r>
+              <w:rPr>
+                <w:color w:val="334155"/>
+                <w:sz w:val="18"/>
+              </w:rPr>
+              <w:t xml:space="preserve"> Se muestra la pantalla exacta de Eurocaja donde se introduce la URL del Webhook.</w:t>
+            </w:r>
+          </w:p>
+          <w:p>
+            <w:pPr>
+              <w:spacing w:before="20" w:after="40"/>
+            </w:pPr>
+            <w:r>
+              <w:rPr>
+                <w:b/>
+                <w:color w:val="0F172A"/>
+                <w:sz w:val="18"/>
+              </w:rPr>
+              <w:t>• 🔄 Botón 'Nuevo Cód.' para Modificaciones:</w:t>
+            </w:r>
+            <w:r>
+              <w:rPr>
+                <w:color w:val="334155"/>
+                <w:sz w:val="18"/>
+              </w:rPr>
+              <w:t xml:space="preserve"> Genera sufijos (GE-XXXXXX-2) si cambian personas para evitar el Error 913 (Pedido repetido).</w:t>
+            </w:r>
+          </w:p>
+          <w:p>
+            <w:pPr>
+              <w:spacing w:before="20" w:after="40"/>
+            </w:pPr>
+            <w:r>
+              <w:rPr>
+                <w:b/>
+                <w:color w:val="0F172A"/>
+                <w:sz w:val="18"/>
+              </w:rPr>
+              <w:t>• 💰 Copia Inteligente del Importe Pendiente:</w:t>
+            </w:r>
+            <w:r>
+              <w:rPr>
+                <w:color w:val="334155"/>
+                <w:sz w:val="18"/>
+              </w:rPr>
+              <w:t xml:space="preserve"> Si ya había un pago previo, copia solo la diferencia restante.</w:t>
+            </w:r>
+          </w:p>
+          <w:p>
+            <w:pPr>
+              <w:spacing w:before="20" w:after="40"/>
+            </w:pPr>
+            <w:r>
+              <w:rPr>
+                <w:b/>
+                <w:color w:val="0F172A"/>
+                <w:sz w:val="18"/>
+              </w:rPr>
+              <w:t>• 📋 Copia Directa de URL en el Modal:</w:t>
+            </w:r>
+            <w:r>
+              <w:rPr>
+                <w:color w:val="334155"/>
+                <w:sz w:val="18"/>
+              </w:rPr>
+              <w:t xml:space="preserve"> Botón '📋 Copiar URL Webhook' en la propia ficha para agilizar el proceso.</w:t>
+            </w:r>
+          </w:p>
+          <w:p>
+            <w:pPr>
+              <w:spacing w:before="20" w:after="40"/>
+            </w:pPr>
+            <w:r>
+              <w:rPr>
+                <w:b/>
+                <w:color w:val="0F172A"/>
+                <w:sz w:val="18"/>
+              </w:rPr>
+              <w:t>• 🔓 Guardado Flexible de Reserva:</w:t>
+            </w:r>
+            <w:r>
+              <w:rPr>
+                <w:color w:val="334155"/>
+                <w:sz w:val="18"/>
+              </w:rPr>
+              <w:t xml:space="preserve"> Permite guardar la reserva en blanco y añadir el enlace PayGold más tarde.</w:t>
+            </w:r>
+          </w:p>
+        </w:tc>
+      </w:tr>
+    </w:tbl>
+    <w:p>
+      <w:pPr>
+        <w:spacing w:after="160"/>
+      </w:pPr>
     </w:p>
     <w:p>
       <w:pPr>
@@ -552,6 +715,19 @@
     </w:p>
     <w:p>
       <w:pPr>
+        <w:pStyle w:val="ListBullet"/>
+        <w:spacing w:before="20" w:after="40"/>
+      </w:pPr>
+      <w:r>
+        <w:rPr>
+          <w:color w:val="334155"/>
+          <w:sz w:val="19"/>
+        </w:rPr>
+        <w:t>Puedes guardar la ficha en cualquier momento sin necesidad de tener el enlace todavía.</w:t>
+      </w:r>
+    </w:p>
+    <w:p>
+      <w:pPr>
         <w:spacing w:before="120" w:after="40"/>
         <w:jc w:val="center"/>
       </w:pPr>
@@ -984,7 +1160,165 @@
           <w:color w:val="166534"/>
           <w:sz w:val="24"/>
         </w:rPr>
-        <w:t>PASO 5: Sincronización Automática (Webhook) y Conciliación con Isabel</w:t>
+        <w:t>PASO 5: Dónde se Configura el Webhook en Eurocaja (Notificación Online)</w:t>
+      </w:r>
+    </w:p>
+    <w:p>
+      <w:pPr>
+        <w:pStyle w:val="ListBullet"/>
+        <w:spacing w:before="20" w:after="40"/>
+      </w:pPr>
+      <w:r>
+        <w:rPr>
+          <w:color w:val="334155"/>
+          <w:sz w:val="19"/>
+        </w:rPr>
+        <w:t>Para que Eurocaja Rural notifique en tiempo real a MesaChef cada cobro, se configura una sola vez:</w:t>
+      </w:r>
+    </w:p>
+    <w:p>
+      <w:pPr>
+        <w:pStyle w:val="ListBullet"/>
+        <w:spacing w:before="20" w:after="40"/>
+      </w:pPr>
+      <w:r>
+        <w:rPr>
+          <w:color w:val="334155"/>
+          <w:sz w:val="19"/>
+        </w:rPr>
+        <w:t>Accede a la administración del comercio 168355840-001 en Redsys Canales.</w:t>
+      </w:r>
+    </w:p>
+    <w:p>
+      <w:pPr>
+        <w:pStyle w:val="ListBullet"/>
+        <w:spacing w:before="20" w:after="40"/>
+      </w:pPr>
+      <w:r>
+        <w:rPr>
+          <w:color w:val="334155"/>
+          <w:sz w:val="19"/>
+        </w:rPr>
+        <w:t>En la sección Parámetros del TPV Virtual &gt; Notificación online:</w:t>
+      </w:r>
+    </w:p>
+    <w:p>
+      <w:pPr>
+        <w:pStyle w:val="ListBullet"/>
+        <w:spacing w:before="20" w:after="40"/>
+      </w:pPr>
+      <w:r>
+        <w:rPr>
+          <w:color w:val="334155"/>
+          <w:sz w:val="19"/>
+        </w:rPr>
+        <w:t>Marca la casilla: ☑️ Notificar resultado a la siguiente URL.</w:t>
+      </w:r>
+    </w:p>
+    <w:p>
+      <w:pPr>
+        <w:pStyle w:val="ListBullet"/>
+        <w:spacing w:before="20" w:after="40"/>
+      </w:pPr>
+      <w:r>
+        <w:rPr>
+          <w:color w:val="334155"/>
+          <w:sz w:val="19"/>
+        </w:rPr>
+        <w:t>En 'URL destino notificación', pega la URL: https://europe-west1-mesa-chef-prod.cloudfunctions.net/redsysWebhook</w:t>
+      </w:r>
+    </w:p>
+    <w:p>
+      <w:pPr>
+        <w:pStyle w:val="ListBullet"/>
+        <w:spacing w:before="20" w:after="40"/>
+      </w:pPr>
+      <w:r>
+        <w:rPr>
+          <w:color w:val="334155"/>
+          <w:sz w:val="19"/>
+        </w:rPr>
+        <w:t>(En MesaChef dispones del botón '📋 Copiar URL Webhook' para copiarla con 1 clic).</w:t>
+      </w:r>
+    </w:p>
+    <w:p>
+      <w:pPr>
+        <w:pStyle w:val="ListBullet"/>
+        <w:spacing w:before="20" w:after="40"/>
+      </w:pPr>
+      <w:r>
+        <w:rPr>
+          <w:color w:val="334155"/>
+          <w:sz w:val="19"/>
+        </w:rPr>
+        <w:t>Pulsa Aceptar / Guardar.</w:t>
+      </w:r>
+    </w:p>
+    <w:p>
+      <w:pPr>
+        <w:spacing w:before="120" w:after="40"/>
+        <w:jc w:val="center"/>
+      </w:pPr>
+      <w:r>
+        <w:drawing>
+          <wp:inline xmlns:a="http://schemas.openxmlformats.org/drawingml/2006/main" xmlns:pic="http://schemas.openxmlformats.org/drawingml/2006/picture">
+            <wp:extent cx="5029200" cy="1082580"/>
+            <wp:docPr id="5" name="Picture 5"/>
+            <wp:cNvGraphicFramePr>
+              <a:graphicFrameLocks noChangeAspect="1"/>
+            </wp:cNvGraphicFramePr>
+            <a:graphic>
+              <a:graphicData uri="http://schemas.openxmlformats.org/drawingml/2006/picture">
+                <pic:pic>
+                  <pic:nvPicPr>
+                    <pic:cNvPr id="0" name="step_webhook_config.png"/>
+                    <pic:cNvPicPr/>
+                  </pic:nvPicPr>
+                  <pic:blipFill>
+                    <a:blip r:embed="rId13"/>
+                    <a:stretch>
+                      <a:fillRect/>
+                    </a:stretch>
+                  </pic:blipFill>
+                  <pic:spPr>
+                    <a:xfrm>
+                      <a:off x="0" y="0"/>
+                      <a:ext cx="5029200" cy="1082580"/>
+                    </a:xfrm>
+                    <a:prstGeom prst="rect"/>
+                  </pic:spPr>
+                </pic:pic>
+              </a:graphicData>
+            </a:graphic>
+          </wp:inline>
+        </w:drawing>
+      </w:r>
+    </w:p>
+    <w:p>
+      <w:pPr>
+        <w:spacing w:after="200"/>
+        <w:jc w:val="center"/>
+      </w:pPr>
+      <w:r>
+        <w:rPr>
+          <w:i/>
+          <w:color w:val="64748B"/>
+          <w:sz w:val="17"/>
+        </w:rPr>
+        <w:t>Figura 5: Casilla y campo de URL destino notificación online en el portal de Eurocaja Rural</w:t>
+      </w:r>
+    </w:p>
+    <w:p>
+      <w:pPr>
+        <w:pStyle w:val="Heading2"/>
+        <w:spacing w:before="200" w:after="80"/>
+      </w:pPr>
+      <w:r>
+        <w:rPr>
+          <w:color w:val="166534"/>
+          <w:sz w:val="24"/>
+        </w:rPr>
+        <w:t>PASO 6: Sincronización Automática (Webhook) y Conciliación con Isabel</w:t>
       </w:r>
     </w:p>
     <w:p>
@@ -1061,7 +1395,7 @@
         <w:drawing>
           <wp:inline xmlns:a="http://schemas.openxmlformats.org/drawingml/2006/main" xmlns:pic="http://schemas.openxmlformats.org/drawingml/2006/picture">
             <wp:extent cx="5029200" cy="952718"/>
-            <wp:docPr id="5" name="Picture 5"/>
+            <wp:docPr id="6" name="Picture 6"/>
             <wp:cNvGraphicFramePr>
               <a:graphicFrameLocks noChangeAspect="1"/>
             </wp:cNvGraphicFramePr>
@@ -1073,7 +1407,7 @@
                     <pic:cNvPicPr/>
                   </pic:nvPicPr>
                   <pic:blipFill>
-                    <a:blip r:embed="rId13"/>
+                    <a:blip r:embed="rId14"/>
                     <a:stretch>
                       <a:fillRect/>
                     </a:stretch>
@@ -1103,7 +1437,97 @@
           <w:color w:val="64748B"/>
           <w:sz w:val="17"/>
         </w:rPr>
-        <w:t>Figura 5: Justificante oficial de cobro recibido por Isabel en administración</w:t>
+        <w:t>Figura 6: Justificante oficial de cobro recibido por Isabel en administración</w:t>
+      </w:r>
+    </w:p>
+    <w:p>
+      <w:pPr>
+        <w:pStyle w:val="Heading1"/>
+        <w:spacing w:before="280" w:after="120"/>
+      </w:pPr>
+      <w:r>
+        <w:rPr>
+          <w:color w:val="1E293B"/>
+        </w:rPr>
+        <w:t>3. ¿Qué Hacer si el Cliente Modifica Comensales o Importes?</w:t>
+      </w:r>
+    </w:p>
+    <w:p>
+      <w:pPr>
+        <w:pStyle w:val="ListBullet"/>
+        <w:spacing w:before="20" w:after="40"/>
+      </w:pPr>
+      <w:r>
+        <w:rPr>
+          <w:color w:val="334155"/>
+          <w:sz w:val="19"/>
+        </w:rPr>
+        <w:t>En Redsys NUNCA se puede repetir un número de pedido ya utilizado (Error 913: Pedido repetido).</w:t>
+      </w:r>
+    </w:p>
+    <w:p>
+      <w:pPr>
+        <w:pStyle w:val="ListBullet"/>
+        <w:spacing w:before="20" w:after="40"/>
+      </w:pPr>
+      <w:r>
+        <w:rPr>
+          <w:color w:val="334155"/>
+          <w:sz w:val="19"/>
+        </w:rPr>
+        <w:t>Ajusta los comensales en MesaChef: si eran 2 personas (180 €) y pasan a ser 3 (270 €), el sistema calcula automáticamente el nuevo Pendiente: 90,00 €. Los pagos previos (180 €) se conservan intactos.</w:t>
+      </w:r>
+    </w:p>
+    <w:p>
+      <w:pPr>
+        <w:pStyle w:val="ListBullet"/>
+        <w:spacing w:before="20" w:after="40"/>
+      </w:pPr>
+      <w:r>
+        <w:rPr>
+          <w:color w:val="334155"/>
+          <w:sz w:val="19"/>
+        </w:rPr>
+        <w:t>Genera una nueva versión de pedido con 1 clic: Pulsa el botón '🔄 Nuevo Cód.' junto a Cód. Pedido. El código GE-675270 pasará automáticamente a GE-675270-2.</w:t>
+      </w:r>
+    </w:p>
+    <w:p>
+      <w:pPr>
+        <w:pStyle w:val="ListBullet"/>
+        <w:spacing w:before="20" w:after="40"/>
+      </w:pPr>
+      <w:r>
+        <w:rPr>
+          <w:color w:val="334155"/>
+          <w:sz w:val="19"/>
+        </w:rPr>
+        <w:t>Copia la diferencia: Pulsa '💰 Copiar Importe' (copiará solo los 90,00 € pendientes).</w:t>
+      </w:r>
+    </w:p>
+    <w:p>
+      <w:pPr>
+        <w:pStyle w:val="ListBullet"/>
+        <w:spacing w:before="20" w:after="40"/>
+      </w:pPr>
+      <w:r>
+        <w:rPr>
+          <w:color w:val="334155"/>
+          <w:sz w:val="19"/>
+        </w:rPr>
+        <w:t>Crea el nuevo enlace en Eurocaja: Genera el enlace PayGold con el nuevo código correlativo (GE-675270-2) y los 90 €.</w:t>
+      </w:r>
+    </w:p>
+    <w:p>
+      <w:pPr>
+        <w:pStyle w:val="ListBullet"/>
+        <w:spacing w:before="20" w:after="40"/>
+      </w:pPr>
+      <w:r>
+        <w:rPr>
+          <w:color w:val="334155"/>
+          <w:sz w:val="19"/>
+        </w:rPr>
+        <w:t>Envía el WhatsApp y guarda: Al pagar el cliente, el Webhook suma los nuevos 90 € al historial, completando los 270 € y dejando la reserva al 100% garantizada.</w:t>
       </w:r>
     </w:p>
     <w:p>
@@ -1116,7 +1540,7 @@
           <w:color w:val="94A3B8"/>
           <w:sz w:val="17"/>
         </w:rPr>
-        <w:t>MesaChef Matrix v10.3.0 • Sercotel Hotel Guadiana • Dpto. de Recepción &amp; Administración</w:t>
+        <w:t>MesaChef Matrix v10.3.3 • Sercotel Hotel Guadiana • Dpto. de Recepción &amp; Administración</w:t>
       </w:r>
     </w:p>
     <w:sectPr>

</xml_diff>

<commit_message>
feat: rediseño confidencial de informes de impresion y distincion de resultados v10.3.4
</commit_message>
<xml_diff>
--- a/MANUAL_RECEPCION_PAYGOLD_GUADIANA.docx
+++ b/MANUAL_RECEPCION_PAYGOLD_GUADIANA.docx
@@ -69,7 +69,7 @@
                 <w:color w:val="0369A1"/>
                 <w:sz w:val="20"/>
               </w:rPr>
-              <w:t>✨ NOVEDADES RECIENTES DE ESTA VERSIÓN (MANUAL v10.3.3 • 28/10/2026):</w:t>
+              <w:t>✨ NOVEDADES RECIENTES DE ESTA VERSIÓN (MANUAL v10.3.4 • 28/10/2026):</w:t>
               <w:br/>
             </w:r>
           </w:p>
@@ -191,6 +191,26 @@
                 <w:sz w:val="18"/>
               </w:rPr>
               <w:t xml:space="preserve"> Permite guardar la reserva en blanco y añadir el enlace PayGold más tarde.</w:t>
+            </w:r>
+          </w:p>
+          <w:p>
+            <w:pPr>
+              <w:spacing w:before="20" w:after="40"/>
+            </w:pPr>
+            <w:r>
+              <w:rPr>
+                <w:b/>
+                <w:color w:val="0F172A"/>
+                <w:sz w:val="18"/>
+              </w:rPr>
+              <w:t>• 📊 Diferenciación de Informes de Impresión:</w:t>
+            </w:r>
+            <w:r>
+              <w:rPr>
+                <w:color w:val="334155"/>
+                <w:sz w:val="18"/>
+              </w:rPr>
+              <w:t xml:space="preserve"> La 'Lista de Participantes' no muestra dinero en euros; refleja mesa, comensales, estado (✅ Confirmado / ⏳ Pendiente) y observaciones. Los importes quedan reservados para el 'Resumen Financiero'.</w:t>
             </w:r>
           </w:p>
         </w:tc>
@@ -1540,7 +1560,7 @@
           <w:color w:val="94A3B8"/>
           <w:sz w:val="17"/>
         </w:rPr>
-        <w:t>MesaChef Matrix v10.3.3 • Sercotel Hotel Guadiana • Dpto. de Recepción &amp; Administración</w:t>
+        <w:t>MesaChef Matrix v10.3.4 • Sercotel Hotel Guadiana • Dpto. de Recepción &amp; Administración</w:t>
       </w:r>
     </w:p>
     <w:sectPr>

</xml_diff>

<commit_message>
fix: computar reservas con servicio incluido como pagadas y confirmadas en listados de impresion v10.3.5
</commit_message>
<xml_diff>
--- a/MANUAL_RECEPCION_PAYGOLD_GUADIANA.docx
+++ b/MANUAL_RECEPCION_PAYGOLD_GUADIANA.docx
@@ -35,7 +35,7 @@
           <w:color w:val="475569"/>
           <w:sz w:val="20"/>
         </w:rPr>
-        <w:t>Procedimiento oficial para registrar reservas en MesaChef Matrix v10.3.3, generar enlaces bancarios seguros en Eurocaja Rural (Redsys PayGold), configurar la URL de notificación online automática, enviar confirmaciones con cláusula de cancelación por WhatsApp, la sincronización automática en tiempo real y la conciliación contable con Administración.</w:t>
+        <w:t>Procedimiento oficial para registrar reservas en MesaChef Matrix v10.3.5, generar enlaces bancarios seguros en Eurocaja Rural (Redsys PayGold), configurar la URL de notificación online automática, enviar confirmaciones con cláusula de cancelación por WhatsApp, la sincronización automática en tiempo real y la conciliación contable con Administración.</w:t>
       </w:r>
     </w:p>
     <w:tbl>
@@ -69,7 +69,7 @@
                 <w:color w:val="0369A1"/>
                 <w:sz w:val="20"/>
               </w:rPr>
-              <w:t>✨ NOVEDADES RECIENTES DE ESTA VERSIÓN (MANUAL v10.3.4 • 28/10/2026):</w:t>
+              <w:t>✨ NOVEDADES RECIENTES DE ESTA VERSIÓN (MANUAL v10.3.5 • 28/10/2026):</w:t>
               <w:br/>
             </w:r>
           </w:p>
@@ -1560,7 +1560,7 @@
           <w:color w:val="94A3B8"/>
           <w:sz w:val="17"/>
         </w:rPr>
-        <w:t>MesaChef Matrix v10.3.4 • Sercotel Hotel Guadiana • Dpto. de Recepción &amp; Administración</w:t>
+        <w:t>MesaChef Matrix v10.3.5 • Sercotel Hotel Guadiana • Dpto. de Recepción &amp; Administración</w:t>
       </w:r>
     </w:p>
     <w:sectPr>

</xml_diff>

<commit_message>
fix(print): computar personas confirmadas y pendientes en listado de participantes y bump a v10.3.6
</commit_message>
<xml_diff>
--- a/MANUAL_RECEPCION_PAYGOLD_GUADIANA.docx
+++ b/MANUAL_RECEPCION_PAYGOLD_GUADIANA.docx
@@ -35,7 +35,7 @@
           <w:color w:val="475569"/>
           <w:sz w:val="20"/>
         </w:rPr>
-        <w:t>Procedimiento oficial para registrar reservas en MesaChef Matrix v10.3.5, generar enlaces bancarios seguros en Eurocaja Rural (Redsys PayGold), configurar la URL de notificación online automática, enviar confirmaciones con cláusula de cancelación por WhatsApp, la sincronización automática en tiempo real y la conciliación contable con Administración.</w:t>
+        <w:t>Procedimiento oficial para registrar reservas en MesaChef Matrix v10.3.6, generar enlaces bancarios seguros en Eurocaja Rural (Redsys PayGold), configurar la URL de notificación online automática, enviar confirmaciones con cláusula de cancelación por WhatsApp, la sincronización automática en tiempo real y la conciliación contable con Administración.</w:t>
       </w:r>
     </w:p>
     <w:tbl>
@@ -69,7 +69,7 @@
                 <w:color w:val="0369A1"/>
                 <w:sz w:val="20"/>
               </w:rPr>
-              <w:t>✨ NOVEDADES RECIENTES DE ESTA VERSIÓN (MANUAL v10.3.5 • 28/10/2026):</w:t>
+              <w:t>✨ NOVEDADES RECIENTES DE ESTA VERSIÓN (MANUAL v10.3.6 • 28/10/2026):</w:t>
               <w:br/>
             </w:r>
           </w:p>
@@ -183,14 +183,14 @@
                 <w:color w:val="0F172A"/>
                 <w:sz w:val="18"/>
               </w:rPr>
-              <w:t>• 🔓 Guardado Flexible de Reserva:</w:t>
+              <w:t>• 👥 Cómputo por Personas y Cero Pagos en Lista de Puerta:</w:t>
             </w:r>
             <w:r>
               <w:rPr>
                 <w:color w:val="334155"/>
                 <w:sz w:val="18"/>
               </w:rPr>
-              <w:t xml:space="preserve"> Permite guardar la reserva en blanco y añadir el enlace PayGold más tarde.</w:t>
+              <w:t xml:space="preserve"> La 'Lista de Participantes' no muestra datos monetarios ni de abono; computa personas confirmadas y personas pendientes (en vez de número de reservas), mesa y estado (✅ Confirmado / ⏳ Pendiente). Los importes y saldos quedan reservados para el 'Resumen Financiero'.</w:t>
             </w:r>
           </w:p>
           <w:p>
@@ -203,14 +203,14 @@
                 <w:color w:val="0F172A"/>
                 <w:sz w:val="18"/>
               </w:rPr>
-              <w:t>• 📊 Diferenciación de Informes de Impresión:</w:t>
+              <w:t>• 🔓 Guardado Flexible de Reserva:</w:t>
             </w:r>
             <w:r>
               <w:rPr>
                 <w:color w:val="334155"/>
                 <w:sz w:val="18"/>
               </w:rPr>
-              <w:t xml:space="preserve"> La 'Lista de Participantes' no muestra dinero en euros; refleja mesa, comensales, estado (✅ Confirmado / ⏳ Pendiente) y observaciones. Los importes quedan reservados para el 'Resumen Financiero'.</w:t>
+              <w:t xml:space="preserve"> Permite guardar la reserva en blanco y añadir el enlace PayGold más tarde.</w:t>
             </w:r>
           </w:p>
         </w:tc>
@@ -1560,7 +1560,7 @@
           <w:color w:val="94A3B8"/>
           <w:sz w:val="17"/>
         </w:rPr>
-        <w:t>MesaChef Matrix v10.3.5 • Sercotel Hotel Guadiana • Dpto. de Recepción &amp; Administración</w:t>
+        <w:t>MesaChef Matrix v10.3.6 • Sercotel Hotel Guadiana • Dpto. de Recepción &amp; Administración</w:t>
       </w:r>
     </w:p>
     <w:sectPr>

</xml_diff>

<commit_message>
fix(paygold): ocultar bloque paygold cuando el servicio esta incluido y bump a v10.3.7
</commit_message>
<xml_diff>
--- a/MANUAL_RECEPCION_PAYGOLD_GUADIANA.docx
+++ b/MANUAL_RECEPCION_PAYGOLD_GUADIANA.docx
@@ -35,7 +35,7 @@
           <w:color w:val="475569"/>
           <w:sz w:val="20"/>
         </w:rPr>
-        <w:t>Procedimiento oficial para registrar reservas en MesaChef Matrix v10.3.6, generar enlaces bancarios seguros en Eurocaja Rural (Redsys PayGold), configurar la URL de notificación online automática, enviar confirmaciones con cláusula de cancelación por WhatsApp, la sincronización automática en tiempo real y la conciliación contable con Administración.</w:t>
+        <w:t>Procedimiento oficial para registrar reservas en MesaChef Matrix v10.3.7, generar enlaces bancarios seguros en Eurocaja Rural (Redsys PayGold), configurar la URL de notificación online automática, enviar confirmaciones con cláusula de cancelación por WhatsApp, la sincronización automática en tiempo real y la conciliación contable con Administración.</w:t>
       </w:r>
     </w:p>
     <w:tbl>
@@ -69,8 +69,28 @@
                 <w:color w:val="0369A1"/>
                 <w:sz w:val="20"/>
               </w:rPr>
-              <w:t>✨ NOVEDADES RECIENTES DE ESTA VERSIÓN (MANUAL v10.3.6 • 28/10/2026):</w:t>
+              <w:t>✨ NOVEDADES RECIENTES DE ESTA VERSIÓN (MANUAL v10.3.7 • 28/10/2026):</w:t>
               <w:br/>
+            </w:r>
+          </w:p>
+          <w:p>
+            <w:pPr>
+              <w:spacing w:before="20" w:after="40"/>
+            </w:pPr>
+            <w:r>
+              <w:rPr>
+                <w:b/>
+                <w:color w:val="0F172A"/>
+                <w:sz w:val="18"/>
+              </w:rPr>
+              <w:t>• ✨ Ocultación de PayGold en Servicio Incluido:</w:t>
+            </w:r>
+            <w:r>
+              <w:rPr>
+                <w:color w:val="334155"/>
+                <w:sz w:val="18"/>
+              </w:rPr>
+              <w:t xml:space="preserve"> Al marcar '✓ Servicio Incluido (sin cargo)', el bloque de PayGold y tarjeta desaparece de la ficha con un aviso explicativo.</w:t>
             </w:r>
           </w:p>
           <w:p>
@@ -1560,7 +1580,7 @@
           <w:color w:val="94A3B8"/>
           <w:sz w:val="17"/>
         </w:rPr>
-        <w:t>MesaChef Matrix v10.3.6 • Sercotel Hotel Guadiana • Dpto. de Recepción &amp; Administración</w:t>
+        <w:t>MesaChef Matrix v10.3.7 • Sercotel Hotel Guadiana • Dpto. de Recepción &amp; Administración</w:t>
       </w:r>
     </w:p>
     <w:sectPr>

</xml_diff>

<commit_message>
feat(menu): crear menu web fin de ano 2026 y boton de envio por whatsapp en configuracion de evento
</commit_message>
<xml_diff>
--- a/MANUAL_RECEPCION_PAYGOLD_GUADIANA.docx
+++ b/MANUAL_RECEPCION_PAYGOLD_GUADIANA.docx
@@ -35,7 +35,7 @@
           <w:color w:val="475569"/>
           <w:sz w:val="20"/>
         </w:rPr>
-        <w:t>Procedimiento oficial para registrar reservas en MesaChef Matrix v10.3.7, generar enlaces bancarios seguros en Eurocaja Rural (Redsys PayGold), configurar la URL de notificación online automática, enviar confirmaciones con cláusula de cancelación por WhatsApp, la sincronización automática en tiempo real y la conciliación contable con Administración.</w:t>
+        <w:t>Procedimiento oficial para registrar reservas en MesaChef Matrix v10.3.8, generar enlaces bancarios seguros en Eurocaja Rural (Redsys PayGold), configurar la URL de notificación online automática, enviar confirmaciones con cláusula de cancelación por WhatsApp, la sincronización automática en tiempo real y la conciliación contable con Administración.</w:t>
       </w:r>
     </w:p>
     <w:tbl>
@@ -69,8 +69,28 @@
                 <w:color w:val="0369A1"/>
                 <w:sz w:val="20"/>
               </w:rPr>
-              <w:t>✨ NOVEDADES RECIENTES DE ESTA VERSIÓN (MANUAL v10.3.7 • 28/10/2026):</w:t>
+              <w:t>✨ NOVEDADES RECIENTES DE ESTA VERSIÓN (MANUAL v10.3.8 • 28/10/2026):</w:t>
               <w:br/>
+            </w:r>
+          </w:p>
+          <w:p>
+            <w:pPr>
+              <w:spacing w:before="20" w:after="40"/>
+            </w:pPr>
+            <w:r>
+              <w:rPr>
+                <w:b/>
+                <w:color w:val="0F172A"/>
+                <w:sz w:val="18"/>
+              </w:rPr>
+              <w:t>• 🍽️ Menú Digital de Fin de Año y WhatsApp:</w:t>
+            </w:r>
+            <w:r>
+              <w:rPr>
+                <w:color w:val="334155"/>
+                <w:sz w:val="18"/>
+              </w:rPr>
+              <w:t xml:space="preserve"> Nueva página interactiva del menú (menu-fin-de-ano-2026.html) con botón directo para compartir enlace y ficha por WhatsApp.</w:t>
             </w:r>
           </w:p>
           <w:p>
@@ -1580,7 +1600,7 @@
           <w:color w:val="94A3B8"/>
           <w:sz w:val="17"/>
         </w:rPr>
-        <w:t>MesaChef Matrix v10.3.7 • Sercotel Hotel Guadiana • Dpto. de Recepción &amp; Administración</w:t>
+        <w:t>MesaChef Matrix v10.3.8 • Sercotel Hotel Guadiana • Dpto. de Recepción &amp; Administración</w:t>
       </w:r>
     </w:p>
     <w:sectPr>

</xml_diff>

<commit_message>
fix(print): optimizar folio A4 con margenes de 10mm, titular al 34% e icono discreto en estado y bump a v10.3.9
</commit_message>
<xml_diff>
--- a/MANUAL_RECEPCION_PAYGOLD_GUADIANA.docx
+++ b/MANUAL_RECEPCION_PAYGOLD_GUADIANA.docx
@@ -35,7 +35,7 @@
           <w:color w:val="475569"/>
           <w:sz w:val="20"/>
         </w:rPr>
-        <w:t>Procedimiento oficial para registrar reservas en MesaChef Matrix v10.3.8, generar enlaces bancarios seguros en Eurocaja Rural (Redsys PayGold), configurar la URL de notificación online automática, enviar confirmaciones con cláusula de cancelación por WhatsApp, la sincronización automática en tiempo real y la conciliación contable con Administración.</w:t>
+        <w:t>Procedimiento oficial para registrar reservas en MesaChef Matrix v10.3.9, generar enlaces bancarios seguros en Eurocaja Rural (Redsys PayGold), configurar la URL de notificación online automática, enviar confirmaciones con cláusula de cancelación por WhatsApp, la sincronización automática en tiempo real y la conciliación contable con Administración.</w:t>
       </w:r>
     </w:p>
     <w:tbl>
@@ -69,8 +69,28 @@
                 <w:color w:val="0369A1"/>
                 <w:sz w:val="20"/>
               </w:rPr>
-              <w:t>✨ NOVEDADES RECIENTES DE ESTA VERSIÓN (MANUAL v10.3.8 • 28/10/2026):</w:t>
+              <w:t>✨ NOVEDADES RECIENTES DE ESTA VERSIÓN (MANUAL v10.3.9 • 28/10/2026):</w:t>
               <w:br/>
+            </w:r>
+          </w:p>
+          <w:p>
+            <w:pPr>
+              <w:spacing w:before="20" w:after="40"/>
+            </w:pPr>
+            <w:r>
+              <w:rPr>
+                <w:b/>
+                <w:color w:val="0F172A"/>
+                <w:sz w:val="18"/>
+              </w:rPr>
+              <w:t>• 📄 Optimización de Folio A4 e Iconos Discretos:</w:t>
+            </w:r>
+            <w:r>
+              <w:rPr>
+                <w:color w:val="334155"/>
+                <w:sz w:val="18"/>
+              </w:rPr>
+              <w:t xml:space="preserve"> Impresión de participantes con márgenes reducidos a 10mm, titular al 34% e iconos discretos (✔ / ⏳) sin saltos de línea.</w:t>
             </w:r>
           </w:p>
           <w:p>
@@ -1600,7 +1620,7 @@
           <w:color w:val="94A3B8"/>
           <w:sz w:val="17"/>
         </w:rPr>
-        <w:t>MesaChef Matrix v10.3.8 • Sercotel Hotel Guadiana • Dpto. de Recepción &amp; Administración</w:t>
+        <w:t>MesaChef Matrix v10.3.9 • Sercotel Hotel Guadiana • Dpto. de Recepción &amp; Administración</w:t>
       </w:r>
     </w:p>
     <w:sectPr>

</xml_diff>

<commit_message>
feat(menu): convertir word oficial a pdf de alta resolucion y enlazarlo directamente para envio por whatsapp v10.3.10
</commit_message>
<xml_diff>
--- a/MANUAL_RECEPCION_PAYGOLD_GUADIANA.docx
+++ b/MANUAL_RECEPCION_PAYGOLD_GUADIANA.docx
@@ -35,7 +35,7 @@
           <w:color w:val="475569"/>
           <w:sz w:val="20"/>
         </w:rPr>
-        <w:t>Procedimiento oficial para registrar reservas en MesaChef Matrix v10.3.9, generar enlaces bancarios seguros en Eurocaja Rural (Redsys PayGold), configurar la URL de notificación online automática, enviar confirmaciones con cláusula de cancelación por WhatsApp, la sincronización automática en tiempo real y la conciliación contable con Administración.</w:t>
+        <w:t>Procedimiento oficial para registrar reservas en MesaChef Matrix v10.3.10, generar enlaces bancarios seguros en Eurocaja Rural (Redsys PayGold), configurar la URL de notificación online automática, enviar confirmaciones con cláusula de cancelación por WhatsApp, la sincronización automática en tiempo real y la conciliación contable con Administración.</w:t>
       </w:r>
     </w:p>
     <w:tbl>
@@ -69,8 +69,28 @@
                 <w:color w:val="0369A1"/>
                 <w:sz w:val="20"/>
               </w:rPr>
-              <w:t>✨ NOVEDADES RECIENTES DE ESTA VERSIÓN (MANUAL v10.3.9 • 28/10/2026):</w:t>
+              <w:t>✨ NOVEDADES RECIENTES DE ESTA VERSIÓN (MANUAL v10.3.10 • 28/10/2026):</w:t>
               <w:br/>
+            </w:r>
+          </w:p>
+          <w:p>
+            <w:pPr>
+              <w:spacing w:before="20" w:after="40"/>
+            </w:pPr>
+            <w:r>
+              <w:rPr>
+                <w:b/>
+                <w:color w:val="0F172A"/>
+                <w:sz w:val="18"/>
+              </w:rPr>
+              <w:t>• 📄 Menú Oficial en PDF y Envío por WhatsApp:</w:t>
+            </w:r>
+            <w:r>
+              <w:rPr>
+                <w:color w:val="334155"/>
+                <w:sz w:val="18"/>
+              </w:rPr>
+              <w:t xml:space="preserve"> Conversión directa del documento Word oficial a PDF de alta resolución, enlazado en el evento y listo para enviar por WhatsApp.</w:t>
             </w:r>
           </w:p>
           <w:p>
@@ -91,26 +111,6 @@
                 <w:sz w:val="18"/>
               </w:rPr>
               <w:t xml:space="preserve"> Impresión de participantes con márgenes reducidos a 10mm, titular al 34% e iconos discretos (✔ / ⏳) sin saltos de línea.</w:t>
-            </w:r>
-          </w:p>
-          <w:p>
-            <w:pPr>
-              <w:spacing w:before="20" w:after="40"/>
-            </w:pPr>
-            <w:r>
-              <w:rPr>
-                <w:b/>
-                <w:color w:val="0F172A"/>
-                <w:sz w:val="18"/>
-              </w:rPr>
-              <w:t>• 🍽️ Menú Digital de Fin de Año y WhatsApp:</w:t>
-            </w:r>
-            <w:r>
-              <w:rPr>
-                <w:color w:val="334155"/>
-                <w:sz w:val="18"/>
-              </w:rPr>
-              <w:t xml:space="preserve"> Nueva página interactiva del menú (menu-fin-de-ano-2026.html) con botón directo para compartir enlace y ficha por WhatsApp.</w:t>
             </w:r>
           </w:p>
           <w:p>
@@ -1620,7 +1620,7 @@
           <w:color w:val="94A3B8"/>
           <w:sz w:val="17"/>
         </w:rPr>
-        <w:t>MesaChef Matrix v10.3.9 • Sercotel Hotel Guadiana • Dpto. de Recepción &amp; Administración</w:t>
+        <w:t>MesaChef Matrix v10.3.10 • Sercotel Hotel Guadiana • Dpto. de Recepción &amp; Administración</w:t>
       </w:r>
     </w:p>
     <w:sectPr>

</xml_diff>